<commit_message>
Initial commit – MoonGPT résumé chatbot
</commit_message>
<xml_diff>
--- a/Document.docx
+++ b/Document.docx
@@ -4,15 +4,7 @@
   <w:body>
     <w:p>
       <w:r>
-        <w:t xml:space="preserve">Name - </w:t>
-      </w:r>
-      <w:proofErr w:type="spellStart"/>
-      <w:r>
-        <w:t>Chandramouli</w:t>
-      </w:r>
-      <w:proofErr w:type="spellEnd"/>
-      <w:r>
-        <w:t xml:space="preserve"> Das</w:t>
+        <w:t>Name - Chandramouli Das</w:t>
       </w:r>
     </w:p>
     <w:p>
@@ -98,23 +90,600 @@
     <w:p/>
     <w:p/>
     <w:p>
-      <w:r>
-        <w:t xml:space="preserve">Profile Summary - </w:t>
-      </w:r>
-      <w:r>
-        <w:br/>
-        <w:t xml:space="preserve">Experienced AI/ML Solution Architect &amp; Data Scientist with a strong background in Generative AI, Large Language Models (LLMs), Machine Learning, and Deep Learning, specializing in GPT-4 Turbo, RAG-based architectures, prompt engineering, and predictive analytics. Proven expertise in end-to-end AI/ML product development, working across finance, HR, and automation domains, and leading teams of 10+ professionals to deliver AI-driven solutions that optimize business operations. Hands-on experience in fine-tuning LLMs, NLP, computer vision, and deep learning architectures, with a focus on model optimization, vector databases, and scalable AI deployment. Adept at product management, effectively managing JIRA workflows, Agile methodologies, and cross-functional collaboration to align AI strategies with business objectives. Published multiple research papers and patents in multi-criteria recommender systems, optimization techniques, and AI-based automation, demonstrating a strong research-driven approach to innovation. Proficient in Python, TensorFlow, </w:t>
-      </w:r>
-      <w:proofErr w:type="spellStart"/>
-      <w:r>
-        <w:t>PyTorch</w:t>
-      </w:r>
-      <w:proofErr w:type="spellEnd"/>
-      <w:r>
-        <w:t>, Azure, AWS, and modern AI infrastructure, with a passion for AI research, strategic leadership, and leveraging intelligent automation to drive business transformation and decision-making efficiency.</w:t>
+      <w:pPr>
+        <w:pStyle w:val="p1"/>
+        <w:rPr>
+          <w:b/>
+          <w:bCs/>
+        </w:rPr>
+      </w:pPr>
+      <w:r>
+        <w:rPr>
+          <w:b/>
+          <w:bCs/>
+        </w:rPr>
+        <w:t>Profile Summary</w:t>
+      </w:r>
+    </w:p>
+    <w:p>
+      <w:pPr>
+        <w:pStyle w:val="p1"/>
+      </w:pPr>
+      <w:r>
+        <w:t xml:space="preserve">Seasoned </w:t>
+      </w:r>
+      <w:r>
+        <w:rPr>
+          <w:rStyle w:val="s1"/>
+          <w:b/>
+          <w:bCs/>
+        </w:rPr>
+        <w:t>Senior Data Scientist</w:t>
+      </w:r>
+      <w:r>
+        <w:t xml:space="preserve"> and </w:t>
+      </w:r>
+      <w:r>
+        <w:rPr>
+          <w:rStyle w:val="s1"/>
+          <w:b/>
+          <w:bCs/>
+        </w:rPr>
+        <w:t>AI/ML Solution Architect</w:t>
+      </w:r>
+      <w:r>
+        <w:t xml:space="preserve"> with over 6 years of experience driving end-to-end development and deployment of intelligent systems across diverse domains including </w:t>
+      </w:r>
+      <w:r>
+        <w:rPr>
+          <w:rStyle w:val="s1"/>
+          <w:b/>
+          <w:bCs/>
+        </w:rPr>
+        <w:t>finance, HR tech, legal risk, and business automation</w:t>
+      </w:r>
+      <w:r>
+        <w:t xml:space="preserve">. Specialized in </w:t>
+      </w:r>
+      <w:r>
+        <w:rPr>
+          <w:rStyle w:val="s1"/>
+          <w:b/>
+          <w:bCs/>
+        </w:rPr>
+        <w:t>Generative AI</w:t>
+      </w:r>
+      <w:r>
+        <w:t xml:space="preserve">, </w:t>
+      </w:r>
+      <w:r>
+        <w:rPr>
+          <w:rStyle w:val="s1"/>
+          <w:b/>
+          <w:bCs/>
+        </w:rPr>
+        <w:t>Large Language Models (LLMs)</w:t>
+      </w:r>
+      <w:r>
+        <w:t xml:space="preserve">, and </w:t>
+      </w:r>
+      <w:r>
+        <w:rPr>
+          <w:rStyle w:val="s1"/>
+          <w:b/>
+          <w:bCs/>
+        </w:rPr>
+        <w:t>Retrieval-Augmented Generation (RAG)</w:t>
+      </w:r>
+      <w:r>
+        <w:t xml:space="preserve"> architectures, with hands-on expertise in </w:t>
+      </w:r>
+      <w:r>
+        <w:rPr>
+          <w:rStyle w:val="s1"/>
+          <w:b/>
+          <w:bCs/>
+        </w:rPr>
+        <w:t>GPT-4 Turbo</w:t>
+      </w:r>
+      <w:r>
+        <w:t xml:space="preserve">, </w:t>
+      </w:r>
+      <w:proofErr w:type="spellStart"/>
+      <w:r>
+        <w:rPr>
+          <w:rStyle w:val="s1"/>
+          <w:b/>
+          <w:bCs/>
+        </w:rPr>
+        <w:t>LangChain</w:t>
+      </w:r>
+      <w:proofErr w:type="spellEnd"/>
+      <w:r>
+        <w:t xml:space="preserve">, </w:t>
+      </w:r>
+      <w:proofErr w:type="spellStart"/>
+      <w:r>
+        <w:rPr>
+          <w:rStyle w:val="s1"/>
+          <w:b/>
+          <w:bCs/>
+        </w:rPr>
+        <w:t>LangGraph</w:t>
+      </w:r>
+      <w:proofErr w:type="spellEnd"/>
+      <w:r>
+        <w:t xml:space="preserve">, </w:t>
+      </w:r>
+      <w:r>
+        <w:rPr>
+          <w:rStyle w:val="s1"/>
+          <w:b/>
+          <w:bCs/>
+        </w:rPr>
+        <w:t>agentic workflows</w:t>
+      </w:r>
+      <w:r>
+        <w:t xml:space="preserve">, and </w:t>
+      </w:r>
+      <w:r>
+        <w:rPr>
+          <w:rStyle w:val="s1"/>
+          <w:b/>
+          <w:bCs/>
+        </w:rPr>
+        <w:t>prompt engineering</w:t>
+      </w:r>
+      <w:r>
+        <w:t xml:space="preserve"> for domain-specific applications.</w:t>
+      </w:r>
+    </w:p>
+    <w:p>
+      <w:pPr>
+        <w:pStyle w:val="p3"/>
+      </w:pPr>
+      <w:r>
+        <w:t xml:space="preserve">Expert in building </w:t>
+      </w:r>
+      <w:r>
+        <w:rPr>
+          <w:rStyle w:val="s1"/>
+          <w:b/>
+          <w:bCs/>
+        </w:rPr>
+        <w:t>production-grade AI applications</w:t>
+      </w:r>
+      <w:r>
+        <w:t xml:space="preserve"> using LLMs for document understanding, SQL generation, chatbot creation, identity extraction, and summarization. Demonstrated success in designing scalable pipelines integrating </w:t>
+      </w:r>
+      <w:r>
+        <w:rPr>
+          <w:rStyle w:val="s1"/>
+          <w:b/>
+          <w:bCs/>
+        </w:rPr>
+        <w:t>OCR</w:t>
+      </w:r>
+      <w:r>
+        <w:t xml:space="preserve">, </w:t>
+      </w:r>
+      <w:r>
+        <w:rPr>
+          <w:rStyle w:val="s1"/>
+          <w:b/>
+          <w:bCs/>
+        </w:rPr>
+        <w:t>computer vision</w:t>
+      </w:r>
+      <w:r>
+        <w:t xml:space="preserve">, </w:t>
+      </w:r>
+      <w:r>
+        <w:rPr>
+          <w:rStyle w:val="s1"/>
+          <w:b/>
+          <w:bCs/>
+        </w:rPr>
+        <w:t>NLP</w:t>
+      </w:r>
+      <w:r>
+        <w:t xml:space="preserve">, </w:t>
+      </w:r>
+      <w:r>
+        <w:rPr>
+          <w:rStyle w:val="s1"/>
+          <w:b/>
+          <w:bCs/>
+        </w:rPr>
+        <w:t>vector databases (Pinecone, FAISS)</w:t>
+      </w:r>
+      <w:r>
+        <w:t xml:space="preserve">, and </w:t>
+      </w:r>
+      <w:r>
+        <w:rPr>
+          <w:rStyle w:val="s1"/>
+          <w:b/>
+          <w:bCs/>
+        </w:rPr>
+        <w:t>cloud deployment (Azure, AWS)</w:t>
+      </w:r>
+      <w:r>
+        <w:t>.</w:t>
+      </w:r>
+    </w:p>
+    <w:p>
+      <w:pPr>
+        <w:pStyle w:val="p3"/>
+      </w:pPr>
+      <w:r>
+        <w:t>Led cross-functional teams of 10+ members, managing the complete AI lifecycle — from business requirement gathering and PoC development to prompt optimization, model fine-tuning (</w:t>
+      </w:r>
+      <w:proofErr w:type="spellStart"/>
+      <w:r>
+        <w:t>LoRA</w:t>
+      </w:r>
+      <w:proofErr w:type="spellEnd"/>
+      <w:r>
+        <w:t xml:space="preserve">, PEFT), testing, and deployment using </w:t>
+      </w:r>
+      <w:proofErr w:type="spellStart"/>
+      <w:r>
+        <w:rPr>
+          <w:rStyle w:val="s1"/>
+          <w:b/>
+          <w:bCs/>
+        </w:rPr>
+        <w:t>FastAPI</w:t>
+      </w:r>
+      <w:proofErr w:type="spellEnd"/>
+      <w:r>
+        <w:t xml:space="preserve">, </w:t>
+      </w:r>
+      <w:proofErr w:type="spellStart"/>
+      <w:r>
+        <w:rPr>
+          <w:rStyle w:val="s1"/>
+          <w:b/>
+          <w:bCs/>
+        </w:rPr>
+        <w:t>Streamlit</w:t>
+      </w:r>
+      <w:proofErr w:type="spellEnd"/>
+      <w:r>
+        <w:t>, and microservice-based architectures.</w:t>
+      </w:r>
+    </w:p>
+    <w:p>
+      <w:pPr>
+        <w:pStyle w:val="p3"/>
+      </w:pPr>
+      <w:r>
+        <w:t xml:space="preserve">Proficient in modern </w:t>
+      </w:r>
+      <w:proofErr w:type="spellStart"/>
+      <w:r>
+        <w:rPr>
+          <w:rStyle w:val="s1"/>
+          <w:b/>
+          <w:bCs/>
+        </w:rPr>
+        <w:t>MLOps</w:t>
+      </w:r>
+      <w:proofErr w:type="spellEnd"/>
+      <w:r>
+        <w:t xml:space="preserve"> and </w:t>
+      </w:r>
+      <w:r>
+        <w:rPr>
+          <w:rStyle w:val="s1"/>
+          <w:b/>
+          <w:bCs/>
+        </w:rPr>
+        <w:t>Agile/Scrum</w:t>
+      </w:r>
+      <w:r>
+        <w:t xml:space="preserve"> practices using </w:t>
+      </w:r>
+      <w:r>
+        <w:rPr>
+          <w:rStyle w:val="s1"/>
+          <w:b/>
+          <w:bCs/>
+        </w:rPr>
+        <w:t>JIRA</w:t>
+      </w:r>
+      <w:r>
+        <w:t xml:space="preserve">, with a strong focus on model interpretability, ethical AI, and cost-efficient token optimization. Published peer-reviewed papers and patents in areas like </w:t>
+      </w:r>
+      <w:r>
+        <w:rPr>
+          <w:rStyle w:val="s1"/>
+          <w:b/>
+          <w:bCs/>
+        </w:rPr>
+        <w:t>multi-criteria recommender systems</w:t>
+      </w:r>
+      <w:r>
+        <w:t xml:space="preserve">, </w:t>
+      </w:r>
+      <w:r>
+        <w:rPr>
+          <w:rStyle w:val="s1"/>
+          <w:b/>
+          <w:bCs/>
+        </w:rPr>
+        <w:t>deep learning optimization</w:t>
+      </w:r>
+      <w:r>
+        <w:t xml:space="preserve">, and </w:t>
+      </w:r>
+      <w:r>
+        <w:rPr>
+          <w:rStyle w:val="s1"/>
+          <w:b/>
+          <w:bCs/>
+        </w:rPr>
+        <w:t>automated data extraction systems</w:t>
+      </w:r>
+      <w:r>
+        <w:t>.</w:t>
+      </w:r>
+    </w:p>
+    <w:p>
+      <w:pPr>
+        <w:pStyle w:val="p3"/>
+      </w:pPr>
+      <w:r>
+        <w:t>Core strengths include:</w:t>
+      </w:r>
+    </w:p>
+    <w:p>
+      <w:pPr>
+        <w:pStyle w:val="p4"/>
+      </w:pPr>
+      <w:r>
+        <w:t>•</w:t>
+      </w:r>
+      <w:r>
+        <w:rPr>
+          <w:rStyle w:val="apple-tab-span"/>
+        </w:rPr>
+        <w:t xml:space="preserve"> </w:t>
+      </w:r>
+      <w:r>
+        <w:rPr>
+          <w:rStyle w:val="s1"/>
+          <w:b/>
+          <w:bCs/>
+        </w:rPr>
+        <w:t>LLM-based automation</w:t>
+      </w:r>
+      <w:r>
+        <w:t xml:space="preserve"> (text-to-SQL, resume parsing, chatbot reasoning)</w:t>
+      </w:r>
+    </w:p>
+    <w:p>
+      <w:pPr>
+        <w:pStyle w:val="p5"/>
+      </w:pPr>
+      <w:r>
+        <w:rPr>
+          <w:rStyle w:val="s2"/>
+        </w:rPr>
+        <w:t>•</w:t>
+      </w:r>
+      <w:r>
+        <w:rPr>
+          <w:rStyle w:val="apple-tab-span"/>
+        </w:rPr>
+        <w:t xml:space="preserve"> </w:t>
+      </w:r>
+      <w:r>
+        <w:rPr>
+          <w:b/>
+          <w:bCs/>
+        </w:rPr>
+        <w:t>Generative AI product design</w:t>
+      </w:r>
+      <w:r>
+        <w:rPr>
+          <w:rStyle w:val="s2"/>
+        </w:rPr>
+        <w:t xml:space="preserve"> using </w:t>
+      </w:r>
+      <w:proofErr w:type="spellStart"/>
+      <w:r>
+        <w:rPr>
+          <w:b/>
+          <w:bCs/>
+        </w:rPr>
+        <w:t>LangGraph</w:t>
+      </w:r>
+      <w:proofErr w:type="spellEnd"/>
+      <w:r>
+        <w:rPr>
+          <w:b/>
+          <w:bCs/>
+        </w:rPr>
+        <w:t xml:space="preserve"> agentic flows</w:t>
+      </w:r>
+    </w:p>
+    <w:p>
+      <w:pPr>
+        <w:pStyle w:val="p4"/>
+      </w:pPr>
+      <w:r>
+        <w:t>•</w:t>
+      </w:r>
+      <w:r>
+        <w:rPr>
+          <w:rStyle w:val="apple-tab-span"/>
+        </w:rPr>
+        <w:t xml:space="preserve"> </w:t>
+      </w:r>
+      <w:r>
+        <w:rPr>
+          <w:rStyle w:val="s1"/>
+          <w:b/>
+          <w:bCs/>
+        </w:rPr>
+        <w:t>Deep learning models</w:t>
+      </w:r>
+      <w:r>
+        <w:t xml:space="preserve"> for vision and NLP</w:t>
+      </w:r>
+    </w:p>
+    <w:p>
+      <w:pPr>
+        <w:pStyle w:val="p4"/>
+      </w:pPr>
+      <w:r>
+        <w:t>•</w:t>
+      </w:r>
+      <w:r>
+        <w:rPr>
+          <w:rStyle w:val="apple-tab-span"/>
+        </w:rPr>
+        <w:t xml:space="preserve"> </w:t>
+      </w:r>
+      <w:r>
+        <w:rPr>
+          <w:rStyle w:val="s1"/>
+          <w:b/>
+          <w:bCs/>
+        </w:rPr>
+        <w:t>Data strategy</w:t>
+      </w:r>
+      <w:r>
+        <w:t>, KPI design, and client-facing product management</w:t>
+      </w:r>
+    </w:p>
+    <w:p>
+      <w:pPr>
+        <w:pStyle w:val="p4"/>
+      </w:pPr>
+      <w:r>
+        <w:t>•</w:t>
+      </w:r>
+      <w:r>
+        <w:rPr>
+          <w:rStyle w:val="apple-tab-span"/>
+        </w:rPr>
+        <w:t xml:space="preserve"> </w:t>
+      </w:r>
+      <w:r>
+        <w:rPr>
+          <w:rStyle w:val="s1"/>
+          <w:b/>
+          <w:bCs/>
+        </w:rPr>
+        <w:t>Secure AI applications</w:t>
+      </w:r>
+      <w:r>
+        <w:t xml:space="preserve"> in enterprise environments (legal, insurance, finance)</w:t>
+      </w:r>
+    </w:p>
+    <w:p>
+      <w:pPr>
+        <w:pStyle w:val="p2"/>
+      </w:pPr>
+    </w:p>
+    <w:p>
+      <w:pPr>
+        <w:pStyle w:val="p3"/>
+      </w:pPr>
+      <w:r>
+        <w:t>Passionate about translating AI research into scalable, real-world business solutions that enhance decision-making, productivity, and operational excellence.</w:t>
+      </w:r>
+    </w:p>
+    <w:p>
+      <w:r>
+        <w:t xml:space="preserve">Company </w:t>
+      </w:r>
+      <w:proofErr w:type="gramStart"/>
+      <w:r>
+        <w:t>Details :</w:t>
+      </w:r>
+      <w:proofErr w:type="gramEnd"/>
+    </w:p>
+    <w:p>
+      <w:pPr>
+        <w:pStyle w:val="ListParagraph"/>
+        <w:numPr>
+          <w:ilvl w:val="0"/>
+          <w:numId w:val="12"/>
+        </w:numPr>
+      </w:pPr>
+      <w:proofErr w:type="spellStart"/>
+      <w:r>
+        <w:t>Gramener</w:t>
+      </w:r>
+      <w:proofErr w:type="spellEnd"/>
+      <w:r>
+        <w:t xml:space="preserve"> – A </w:t>
+      </w:r>
+      <w:proofErr w:type="spellStart"/>
+      <w:r>
+        <w:t>Straive</w:t>
+      </w:r>
+      <w:proofErr w:type="spellEnd"/>
+      <w:r>
+        <w:t xml:space="preserve"> Company (Current)</w:t>
+      </w:r>
+    </w:p>
+    <w:p>
+      <w:pPr>
+        <w:pStyle w:val="ListParagraph"/>
+        <w:numPr>
+          <w:ilvl w:val="0"/>
+          <w:numId w:val="12"/>
+        </w:numPr>
+      </w:pPr>
+      <w:r>
+        <w:t xml:space="preserve">Proxima Systems </w:t>
+      </w:r>
+    </w:p>
+    <w:p>
+      <w:pPr>
+        <w:pStyle w:val="ListParagraph"/>
+        <w:numPr>
+          <w:ilvl w:val="0"/>
+          <w:numId w:val="12"/>
+        </w:numPr>
+      </w:pPr>
+      <w:proofErr w:type="spellStart"/>
+      <w:r>
+        <w:t>Highradius</w:t>
+      </w:r>
+      <w:proofErr w:type="spellEnd"/>
+      <w:r>
+        <w:t xml:space="preserve"> </w:t>
+      </w:r>
+      <w:proofErr w:type="spellStart"/>
+      <w:r>
+        <w:t>Coporation</w:t>
+      </w:r>
+      <w:proofErr w:type="spellEnd"/>
+    </w:p>
+    <w:p>
+      <w:pPr>
+        <w:pStyle w:val="ListParagraph"/>
+        <w:numPr>
+          <w:ilvl w:val="0"/>
+          <w:numId w:val="12"/>
+        </w:numPr>
+      </w:pPr>
+      <w:r>
+        <w:t>KIIT University</w:t>
       </w:r>
     </w:p>
     <w:p/>
+    <w:p>
+      <w:r>
+        <w:t>Check for more details in the professional experience.</w:t>
+      </w:r>
+    </w:p>
     <w:p/>
     <w:p>
       <w:r>
@@ -130,7 +699,23 @@
         </w:numPr>
       </w:pPr>
       <w:r>
-        <w:t>AI/ML Solution Architect - Proxima Systems</w:t>
+        <w:t xml:space="preserve">Senior Data Scientist – </w:t>
+      </w:r>
+      <w:proofErr w:type="spellStart"/>
+      <w:r>
+        <w:t>Gramener</w:t>
+      </w:r>
+      <w:proofErr w:type="spellEnd"/>
+      <w:r>
+        <w:t xml:space="preserve"> – A </w:t>
+      </w:r>
+      <w:proofErr w:type="spellStart"/>
+      <w:r>
+        <w:t>Straive</w:t>
+      </w:r>
+      <w:proofErr w:type="spellEnd"/>
+      <w:r>
+        <w:t xml:space="preserve"> Company</w:t>
       </w:r>
     </w:p>
     <w:p>
@@ -144,7 +729,7 @@
         <w:rPr>
           <w:i/>
         </w:rPr>
-        <w:t>(Sep-2024 – Mar-2025)</w:t>
+        <w:t>(Mar-2024 – Present)</w:t>
       </w:r>
     </w:p>
     <w:p>
@@ -155,31 +740,7 @@
         </w:numPr>
       </w:pPr>
       <w:r>
-        <w:rPr>
-          <w:b/>
-        </w:rPr>
-        <w:t>Led a cross-functional AI/ML team</w:t>
-      </w:r>
-      <w:r>
-        <w:t xml:space="preserve">, overseeing </w:t>
-      </w:r>
-      <w:r>
-        <w:rPr>
-          <w:b/>
-        </w:rPr>
-        <w:t>end-to-end project delivery</w:t>
-      </w:r>
-      <w:r>
-        <w:t xml:space="preserve"> from </w:t>
-      </w:r>
-      <w:r>
-        <w:rPr>
-          <w:b/>
-        </w:rPr>
-        <w:t>requirement analysis to deployment</w:t>
-      </w:r>
-      <w:r>
-        <w:t>, ensuring scalable and high-performance AI solutions.</w:t>
+        <w:t>Leading end-to-end Generative AI (GenAI) initiatives, from solution design to deployment.</w:t>
       </w:r>
     </w:p>
     <w:p>
@@ -190,31 +751,7 @@
         </w:numPr>
       </w:pPr>
       <w:r>
-        <w:rPr>
-          <w:b/>
-        </w:rPr>
-        <w:t>Hands-on development and optimization</w:t>
-      </w:r>
-      <w:r>
-        <w:t xml:space="preserve"> of </w:t>
-      </w:r>
-      <w:r>
-        <w:rPr>
-          <w:b/>
-        </w:rPr>
-        <w:t>LLM fine-tuning, prompt engineering, RAG-based applications, and predictive analytics models</w:t>
-      </w:r>
-      <w:r>
-        <w:t xml:space="preserve">, leveraging </w:t>
-      </w:r>
-      <w:r>
-        <w:rPr>
-          <w:b/>
-        </w:rPr>
-        <w:t>cloud platforms (AWS, Azure, GCP)</w:t>
-      </w:r>
-      <w:r>
-        <w:t>.</w:t>
+        <w:t>Spearheading product management, ensuring alignment with client goals and business value.</w:t>
       </w:r>
     </w:p>
     <w:p>
@@ -225,72 +762,7 @@
         </w:numPr>
       </w:pPr>
       <w:r>
-        <w:rPr>
-          <w:b/>
-        </w:rPr>
-        <w:t xml:space="preserve">Implemented </w:t>
-      </w:r>
-      <w:proofErr w:type="spellStart"/>
-      <w:r>
-        <w:rPr>
-          <w:b/>
-        </w:rPr>
-        <w:t>MLOps</w:t>
-      </w:r>
-      <w:proofErr w:type="spellEnd"/>
-      <w:r>
-        <w:rPr>
-          <w:b/>
-        </w:rPr>
-        <w:t xml:space="preserve"> best practices</w:t>
-      </w:r>
-      <w:r>
-        <w:t xml:space="preserve">, integrating </w:t>
-      </w:r>
-      <w:r>
-        <w:rPr>
-          <w:b/>
-        </w:rPr>
-        <w:t>CI/CD pipelines, containerization (Docker/Kubernetes), and model monitoring</w:t>
-      </w:r>
-      <w:r>
-        <w:t xml:space="preserve">, while mentoring team members in </w:t>
-      </w:r>
-      <w:r>
-        <w:rPr>
-          <w:b/>
-        </w:rPr>
-        <w:t>AI/ML advancements</w:t>
-      </w:r>
-      <w:r>
-        <w:t xml:space="preserve">. </w:t>
-      </w:r>
-    </w:p>
-    <w:p>
-      <w:pPr>
-        <w:numPr>
-          <w:ilvl w:val="0"/>
-          <w:numId w:val="7"/>
-        </w:numPr>
-      </w:pPr>
-      <w:r>
-        <w:t xml:space="preserve">Data Scientist - </w:t>
-      </w:r>
-      <w:proofErr w:type="spellStart"/>
-      <w:r>
-        <w:t>Highradius</w:t>
-      </w:r>
-      <w:proofErr w:type="spellEnd"/>
-      <w:r>
-        <w:t xml:space="preserve"> Technology </w:t>
-      </w:r>
-      <w:proofErr w:type="spellStart"/>
-      <w:r>
-        <w:t>pvt</w:t>
-      </w:r>
-      <w:proofErr w:type="spellEnd"/>
-      <w:r>
-        <w:t xml:space="preserve"> ltd</w:t>
+        <w:t>Driving client engagement, translating requirements into actionable AI solutions.</w:t>
       </w:r>
     </w:p>
     <w:p>
@@ -301,10 +773,18 @@
         </w:numPr>
       </w:pPr>
       <w:r>
-        <w:rPr>
-          <w:i/>
-        </w:rPr>
-        <w:t>(June 2021 – Aug 2024)</w:t>
+        <w:t>Managing full lifecycle ownership of GenAI-powered products, including architecture, prompt engineering, integration, and delivery.</w:t>
+      </w:r>
+    </w:p>
+    <w:p>
+      <w:pPr>
+        <w:numPr>
+          <w:ilvl w:val="0"/>
+          <w:numId w:val="7"/>
+        </w:numPr>
+      </w:pPr>
+      <w:r>
+        <w:t>AI/ML Solution Architect - Proxima Systems</w:t>
       </w:r>
     </w:p>
     <w:p>
@@ -316,22 +796,9 @@
       </w:pPr>
       <w:r>
         <w:rPr>
-          <w:b/>
-        </w:rPr>
-        <w:lastRenderedPageBreak/>
-        <w:t>Developed and fine-tuned Generative AI models</w:t>
-      </w:r>
-      <w:r>
-        <w:t xml:space="preserve">, including </w:t>
-      </w:r>
-      <w:r>
-        <w:rPr>
-          <w:b/>
-        </w:rPr>
-        <w:t>LLM-based text processing, RAG-based retrieval systems, and AI-driven automation for financial applications</w:t>
-      </w:r>
-      <w:r>
-        <w:t>.</w:t>
+          <w:i/>
+        </w:rPr>
+        <w:t>(Sep-2024 – Mar-2025)</w:t>
       </w:r>
     </w:p>
     <w:p>
@@ -345,19 +812,28 @@
         <w:rPr>
           <w:b/>
         </w:rPr>
-        <w:t>Designed and implemented machine learning and deep learning models</w:t>
-      </w:r>
-      <w:r>
-        <w:t xml:space="preserve"> for </w:t>
-      </w:r>
-      <w:r>
-        <w:rPr>
-          <w:b/>
-        </w:rPr>
-        <w:t>predictive analytics, credit risk assessment, and customer behavior analysis</w:t>
-      </w:r>
-      <w:r>
-        <w:t>, enhancing decision-making.</w:t>
+        <w:t>Led a cross-functional AI/ML team</w:t>
+      </w:r>
+      <w:r>
+        <w:t xml:space="preserve">, overseeing </w:t>
+      </w:r>
+      <w:r>
+        <w:rPr>
+          <w:b/>
+        </w:rPr>
+        <w:t>end-to-end project delivery</w:t>
+      </w:r>
+      <w:r>
+        <w:t xml:space="preserve"> from </w:t>
+      </w:r>
+      <w:r>
+        <w:rPr>
+          <w:b/>
+        </w:rPr>
+        <w:t>requirement analysis to deployment</w:t>
+      </w:r>
+      <w:r>
+        <w:t>, ensuring scalable and high-performance AI solutions.</w:t>
       </w:r>
     </w:p>
     <w:p>
@@ -371,19 +847,28 @@
         <w:rPr>
           <w:b/>
         </w:rPr>
-        <w:t>Led end-to-end AI/ML product development</w:t>
-      </w:r>
-      <w:r>
-        <w:t xml:space="preserve">, collaborating with </w:t>
-      </w:r>
-      <w:r>
-        <w:rPr>
-          <w:b/>
-        </w:rPr>
-        <w:t>product managers, engineers, and business stakeholders</w:t>
-      </w:r>
-      <w:r>
-        <w:t xml:space="preserve"> to align AI solutions with business goals.</w:t>
+        <w:t>Hands-on development and optimization</w:t>
+      </w:r>
+      <w:r>
+        <w:t xml:space="preserve"> of </w:t>
+      </w:r>
+      <w:r>
+        <w:rPr>
+          <w:b/>
+        </w:rPr>
+        <w:t>LLM fine-tuning, prompt engineering, RAG-based applications, and predictive analytics models</w:t>
+      </w:r>
+      <w:r>
+        <w:t xml:space="preserve">, leveraging </w:t>
+      </w:r>
+      <w:r>
+        <w:rPr>
+          <w:b/>
+        </w:rPr>
+        <w:t>cloud platforms (AWS, Azure, GCP)</w:t>
+      </w:r>
+      <w:r>
+        <w:t>.</w:t>
       </w:r>
     </w:p>
     <w:p>
@@ -397,19 +882,69 @@
         <w:rPr>
           <w:b/>
         </w:rPr>
-        <w:t>Applied NLP techniques</w:t>
-      </w:r>
-      <w:r>
-        <w:t xml:space="preserve"> for </w:t>
-      </w:r>
-      <w:r>
-        <w:rPr>
-          <w:b/>
-        </w:rPr>
-        <w:t>text classification, entity recognition, and intelligent document processing</w:t>
-      </w:r>
-      <w:r>
-        <w:t>, improving workflow automation in financial processes.</w:t>
+        <w:t xml:space="preserve">Implemented </w:t>
+      </w:r>
+      <w:proofErr w:type="spellStart"/>
+      <w:r>
+        <w:rPr>
+          <w:b/>
+        </w:rPr>
+        <w:t>MLOps</w:t>
+      </w:r>
+      <w:proofErr w:type="spellEnd"/>
+      <w:r>
+        <w:rPr>
+          <w:b/>
+        </w:rPr>
+        <w:t xml:space="preserve"> best practices</w:t>
+      </w:r>
+      <w:r>
+        <w:t xml:space="preserve">, integrating </w:t>
+      </w:r>
+      <w:r>
+        <w:rPr>
+          <w:b/>
+        </w:rPr>
+        <w:t>CI/CD pipelines, containerization (Docker/Kubernetes), and model monitoring</w:t>
+      </w:r>
+      <w:r>
+        <w:t xml:space="preserve">, while mentoring team members in </w:t>
+      </w:r>
+      <w:r>
+        <w:rPr>
+          <w:b/>
+        </w:rPr>
+        <w:t>AI/ML advancements</w:t>
+      </w:r>
+      <w:r>
+        <w:t xml:space="preserve">. </w:t>
+      </w:r>
+    </w:p>
+    <w:p>
+      <w:pPr>
+        <w:numPr>
+          <w:ilvl w:val="0"/>
+          <w:numId w:val="7"/>
+        </w:numPr>
+      </w:pPr>
+      <w:r>
+        <w:t xml:space="preserve">Data Scientist - </w:t>
+      </w:r>
+      <w:proofErr w:type="spellStart"/>
+      <w:r>
+        <w:t>Highradius</w:t>
+      </w:r>
+      <w:proofErr w:type="spellEnd"/>
+      <w:r>
+        <w:t xml:space="preserve"> Technology </w:t>
+      </w:r>
+      <w:proofErr w:type="spellStart"/>
+      <w:r>
+        <w:t>pvt</w:t>
+      </w:r>
+      <w:proofErr w:type="spellEnd"/>
+      <w:r>
+        <w:t xml:space="preserve"> ltd</w:t>
       </w:r>
     </w:p>
     <w:p>
@@ -421,22 +956,9 @@
       </w:pPr>
       <w:r>
         <w:rPr>
-          <w:b/>
-        </w:rPr>
-        <w:t>Managed JIRA workflows</w:t>
-      </w:r>
-      <w:r>
-        <w:t xml:space="preserve"> and product </w:t>
-      </w:r>
-      <w:proofErr w:type="spellStart"/>
-      <w:proofErr w:type="gramStart"/>
-      <w:r>
-        <w:t>roadmaps,lead</w:t>
-      </w:r>
-      <w:proofErr w:type="spellEnd"/>
-      <w:proofErr w:type="gramEnd"/>
-      <w:r>
-        <w:t xml:space="preserve"> a team of 10 members ensuring structured execution of AI-driven features and seamless integration into existing enterprise platforms.</w:t>
+          <w:i/>
+        </w:rPr>
+        <w:t>(June 2021 – Aug 2024)</w:t>
       </w:r>
     </w:p>
     <w:p>
@@ -450,38 +972,19 @@
         <w:rPr>
           <w:b/>
         </w:rPr>
-        <w:t>Mentored and guided junior data scientists</w:t>
-      </w:r>
-      <w:r>
-        <w:t xml:space="preserve">, conducting knowledge-sharing sessions on </w:t>
-      </w:r>
-      <w:r>
-        <w:rPr>
-          <w:b/>
-        </w:rPr>
-        <w:t>LLMs, deep learning architectures, and advanced machine learning techniques</w:t>
-      </w:r>
-      <w:r>
-        <w:t xml:space="preserve">. </w:t>
-      </w:r>
-    </w:p>
-    <w:p>
-      <w:pPr>
-        <w:numPr>
-          <w:ilvl w:val="0"/>
-          <w:numId w:val="7"/>
-        </w:numPr>
-      </w:pPr>
-      <w:r>
-        <w:t xml:space="preserve">Technical Assistant - </w:t>
-      </w:r>
-      <w:proofErr w:type="spellStart"/>
-      <w:r>
-        <w:t>KIIt</w:t>
-      </w:r>
-      <w:proofErr w:type="spellEnd"/>
-      <w:r>
-        <w:t xml:space="preserve"> University </w:t>
+        <w:t>Developed and fine-tuned Generative AI models</w:t>
+      </w:r>
+      <w:r>
+        <w:t xml:space="preserve">, including </w:t>
+      </w:r>
+      <w:r>
+        <w:rPr>
+          <w:b/>
+        </w:rPr>
+        <w:t>LLM-based text processing, RAG-based retrieval systems, and AI-driven automation for financial applications</w:t>
+      </w:r>
+      <w:r>
+        <w:t>.</w:t>
       </w:r>
     </w:p>
     <w:p>
@@ -493,9 +996,21 @@
       </w:pPr>
       <w:r>
         <w:rPr>
-          <w:i/>
-        </w:rPr>
-        <w:t>(Aug 2019 – May 2021)</w:t>
+          <w:b/>
+        </w:rPr>
+        <w:t>Designed and implemented machine learning and deep learning models</w:t>
+      </w:r>
+      <w:r>
+        <w:t xml:space="preserve"> for </w:t>
+      </w:r>
+      <w:r>
+        <w:rPr>
+          <w:b/>
+        </w:rPr>
+        <w:t>predictive analytics, credit risk assessment, and customer behavior analysis</w:t>
+      </w:r>
+      <w:r>
+        <w:t>, enhancing decision-making.</w:t>
       </w:r>
     </w:p>
     <w:p>
@@ -509,19 +1024,20 @@
         <w:rPr>
           <w:b/>
         </w:rPr>
-        <w:t>Automated academic and administrative workflows</w:t>
-      </w:r>
-      <w:r>
-        <w:t xml:space="preserve">, developing </w:t>
-      </w:r>
-      <w:r>
-        <w:rPr>
-          <w:b/>
-        </w:rPr>
-        <w:t>custom Python scripts</w:t>
-      </w:r>
-      <w:r>
-        <w:t xml:space="preserve"> and AI-driven tools to streamline research data processing and grading systems.</w:t>
+        <w:lastRenderedPageBreak/>
+        <w:t>Led end-to-end AI/ML product development</w:t>
+      </w:r>
+      <w:r>
+        <w:t xml:space="preserve">, collaborating with </w:t>
+      </w:r>
+      <w:r>
+        <w:rPr>
+          <w:b/>
+        </w:rPr>
+        <w:t>product managers, engineers, and business stakeholders</w:t>
+      </w:r>
+      <w:r>
+        <w:t xml:space="preserve"> to align AI solutions with business goals.</w:t>
       </w:r>
     </w:p>
     <w:p>
@@ -535,19 +1051,19 @@
         <w:rPr>
           <w:b/>
         </w:rPr>
-        <w:t>Conducted research in AI/ML and data science</w:t>
-      </w:r>
-      <w:r>
-        <w:t xml:space="preserve">, collaborating with faculty on </w:t>
-      </w:r>
-      <w:r>
-        <w:rPr>
-          <w:b/>
-        </w:rPr>
-        <w:t>academic projects, algorithm optimization, and real-world AI applications</w:t>
-      </w:r>
-      <w:r>
-        <w:t>.</w:t>
+        <w:t>Applied NLP techniques</w:t>
+      </w:r>
+      <w:r>
+        <w:t xml:space="preserve"> for </w:t>
+      </w:r>
+      <w:r>
+        <w:rPr>
+          <w:b/>
+        </w:rPr>
+        <w:t>text classification, entity recognition, and intelligent document processing</w:t>
+      </w:r>
+      <w:r>
+        <w:t>, improving workflow automation in financial processes.</w:t>
       </w:r>
     </w:p>
     <w:p>
@@ -561,19 +1077,20 @@
         <w:rPr>
           <w:b/>
         </w:rPr>
-        <w:t>Delivered hands-on training sessions</w:t>
-      </w:r>
-      <w:r>
-        <w:t xml:space="preserve"> on </w:t>
-      </w:r>
-      <w:r>
-        <w:rPr>
-          <w:b/>
-        </w:rPr>
-        <w:t>machine learning, deep learning, and data science</w:t>
-      </w:r>
-      <w:r>
-        <w:t>, mentoring students and assisting with coursework.</w:t>
+        <w:t>Managed JIRA workflows</w:t>
+      </w:r>
+      <w:r>
+        <w:t xml:space="preserve"> and product </w:t>
+      </w:r>
+      <w:proofErr w:type="spellStart"/>
+      <w:proofErr w:type="gramStart"/>
+      <w:r>
+        <w:t>roadmaps,lead</w:t>
+      </w:r>
+      <w:proofErr w:type="spellEnd"/>
+      <w:proofErr w:type="gramEnd"/>
+      <w:r>
+        <w:t xml:space="preserve"> a team of 10 members ensuring structured execution of AI-driven features and seamless integration into existing enterprise platforms.</w:t>
       </w:r>
     </w:p>
     <w:p>
@@ -582,6 +1099,143 @@
           <w:ilvl w:val="1"/>
           <w:numId w:val="7"/>
         </w:numPr>
+      </w:pPr>
+      <w:r>
+        <w:rPr>
+          <w:b/>
+        </w:rPr>
+        <w:t>Mentored and guided junior data scientists</w:t>
+      </w:r>
+      <w:r>
+        <w:t xml:space="preserve">, conducting knowledge-sharing sessions on </w:t>
+      </w:r>
+      <w:r>
+        <w:rPr>
+          <w:b/>
+        </w:rPr>
+        <w:t>LLMs, deep learning architectures, and advanced machine learning techniques</w:t>
+      </w:r>
+      <w:r>
+        <w:t xml:space="preserve">. </w:t>
+      </w:r>
+    </w:p>
+    <w:p>
+      <w:pPr>
+        <w:numPr>
+          <w:ilvl w:val="0"/>
+          <w:numId w:val="7"/>
+        </w:numPr>
+      </w:pPr>
+      <w:r>
+        <w:t xml:space="preserve">Technical Assistant - </w:t>
+      </w:r>
+      <w:proofErr w:type="spellStart"/>
+      <w:r>
+        <w:t>KIIt</w:t>
+      </w:r>
+      <w:proofErr w:type="spellEnd"/>
+      <w:r>
+        <w:t xml:space="preserve"> University </w:t>
+      </w:r>
+    </w:p>
+    <w:p>
+      <w:pPr>
+        <w:numPr>
+          <w:ilvl w:val="1"/>
+          <w:numId w:val="7"/>
+        </w:numPr>
+      </w:pPr>
+      <w:r>
+        <w:rPr>
+          <w:i/>
+        </w:rPr>
+        <w:t>(Aug 2019 – May 2021)</w:t>
+      </w:r>
+    </w:p>
+    <w:p>
+      <w:pPr>
+        <w:numPr>
+          <w:ilvl w:val="1"/>
+          <w:numId w:val="7"/>
+        </w:numPr>
+      </w:pPr>
+      <w:r>
+        <w:rPr>
+          <w:b/>
+        </w:rPr>
+        <w:t>Automated academic and administrative workflows</w:t>
+      </w:r>
+      <w:r>
+        <w:t xml:space="preserve">, developing </w:t>
+      </w:r>
+      <w:r>
+        <w:rPr>
+          <w:b/>
+        </w:rPr>
+        <w:t>custom Python scripts</w:t>
+      </w:r>
+      <w:r>
+        <w:t xml:space="preserve"> and AI-driven tools to streamline research data processing and grading systems.</w:t>
+      </w:r>
+    </w:p>
+    <w:p>
+      <w:pPr>
+        <w:numPr>
+          <w:ilvl w:val="1"/>
+          <w:numId w:val="7"/>
+        </w:numPr>
+      </w:pPr>
+      <w:r>
+        <w:rPr>
+          <w:b/>
+        </w:rPr>
+        <w:t>Conducted research in AI/ML and data science</w:t>
+      </w:r>
+      <w:r>
+        <w:t xml:space="preserve">, collaborating with faculty on </w:t>
+      </w:r>
+      <w:r>
+        <w:rPr>
+          <w:b/>
+        </w:rPr>
+        <w:t>academic projects, algorithm optimization, and real-world AI applications</w:t>
+      </w:r>
+      <w:r>
+        <w:t>.</w:t>
+      </w:r>
+    </w:p>
+    <w:p>
+      <w:pPr>
+        <w:numPr>
+          <w:ilvl w:val="1"/>
+          <w:numId w:val="7"/>
+        </w:numPr>
+      </w:pPr>
+      <w:r>
+        <w:rPr>
+          <w:b/>
+        </w:rPr>
+        <w:t>Delivered hands-on training sessions</w:t>
+      </w:r>
+      <w:r>
+        <w:t xml:space="preserve"> on </w:t>
+      </w:r>
+      <w:r>
+        <w:rPr>
+          <w:b/>
+        </w:rPr>
+        <w:t>machine learning, deep learning, and data science</w:t>
+      </w:r>
+      <w:r>
+        <w:t>, mentoring students and assisting with coursework.</w:t>
+      </w:r>
+    </w:p>
+    <w:p>
+      <w:pPr>
+        <w:numPr>
+          <w:ilvl w:val="1"/>
+          <w:numId w:val="7"/>
+        </w:numPr>
         <w:spacing w:after="240"/>
       </w:pPr>
       <w:r>
@@ -618,6 +1272,269 @@
         <w:t xml:space="preserve">Professional Experience Project- </w:t>
       </w:r>
     </w:p>
+    <w:p>
+      <w:proofErr w:type="spellStart"/>
+      <w:r>
+        <w:t>Straive</w:t>
+      </w:r>
+      <w:proofErr w:type="spellEnd"/>
+      <w:r>
+        <w:t xml:space="preserve"> – </w:t>
+      </w:r>
+    </w:p>
+    <w:p>
+      <w:pPr>
+        <w:pStyle w:val="p1"/>
+        <w:numPr>
+          <w:ilvl w:val="0"/>
+          <w:numId w:val="2"/>
+        </w:numPr>
+        <w:rPr>
+          <w:rFonts w:ascii="Arial" w:eastAsia="Arial" w:hAnsi="Arial" w:cs="Arial"/>
+          <w:b/>
+          <w:sz w:val="22"/>
+          <w:szCs w:val="22"/>
+          <w:lang w:val="en"/>
+        </w:rPr>
+      </w:pPr>
+      <w:r>
+        <w:rPr>
+          <w:rFonts w:ascii="Arial" w:eastAsia="Arial" w:hAnsi="Arial" w:cs="Arial"/>
+          <w:bCs/>
+          <w:sz w:val="22"/>
+          <w:szCs w:val="22"/>
+          <w:lang w:val="en"/>
+        </w:rPr>
+        <w:t>LNR Risk -</w:t>
+      </w:r>
+      <w:r>
+        <w:rPr>
+          <w:rFonts w:ascii="Arial" w:eastAsia="Arial" w:hAnsi="Arial" w:cs="Arial"/>
+          <w:b/>
+          <w:sz w:val="22"/>
+          <w:szCs w:val="22"/>
+          <w:lang w:val="en"/>
+        </w:rPr>
+        <w:t xml:space="preserve"> </w:t>
+      </w:r>
+      <w:r>
+        <w:rPr>
+          <w:rFonts w:ascii="Arial" w:eastAsia="Arial" w:hAnsi="Arial" w:cs="Arial"/>
+          <w:bCs/>
+          <w:sz w:val="22"/>
+          <w:szCs w:val="22"/>
+          <w:lang w:val="en"/>
+        </w:rPr>
+        <w:t xml:space="preserve">Currently leading the development of an end-to-end OCR and Generative AI-based document processing pipeline for a Legal &amp; Risk (LNR) client. The solution extracts, classifies, and summarizes identity documents, complaints, and legal notices using OCR and GPT-4o via </w:t>
+      </w:r>
+      <w:proofErr w:type="spellStart"/>
+      <w:r>
+        <w:rPr>
+          <w:rFonts w:ascii="Arial" w:eastAsia="Arial" w:hAnsi="Arial" w:cs="Arial"/>
+          <w:bCs/>
+          <w:sz w:val="22"/>
+          <w:szCs w:val="22"/>
+          <w:lang w:val="en"/>
+        </w:rPr>
+        <w:t>LLMFoundry</w:t>
+      </w:r>
+      <w:proofErr w:type="spellEnd"/>
+      <w:r>
+        <w:rPr>
+          <w:rFonts w:ascii="Arial" w:eastAsia="Arial" w:hAnsi="Arial" w:cs="Arial"/>
+          <w:bCs/>
+          <w:sz w:val="22"/>
+          <w:szCs w:val="22"/>
+          <w:lang w:val="en"/>
+        </w:rPr>
+        <w:t xml:space="preserve">. It supports both single and bulk processing modes, delivering structured Word summaries with extracted identity fields, key context, and actionable insights. Built with </w:t>
+      </w:r>
+      <w:proofErr w:type="spellStart"/>
+      <w:r>
+        <w:rPr>
+          <w:rFonts w:ascii="Arial" w:eastAsia="Arial" w:hAnsi="Arial" w:cs="Arial"/>
+          <w:bCs/>
+          <w:sz w:val="22"/>
+          <w:szCs w:val="22"/>
+          <w:lang w:val="en"/>
+        </w:rPr>
+        <w:t>FastAPI</w:t>
+      </w:r>
+      <w:proofErr w:type="spellEnd"/>
+      <w:r>
+        <w:rPr>
+          <w:rFonts w:ascii="Arial" w:eastAsia="Arial" w:hAnsi="Arial" w:cs="Arial"/>
+          <w:bCs/>
+          <w:sz w:val="22"/>
+          <w:szCs w:val="22"/>
+          <w:lang w:val="en"/>
+        </w:rPr>
+        <w:t xml:space="preserve">, </w:t>
+      </w:r>
+      <w:proofErr w:type="spellStart"/>
+      <w:r>
+        <w:rPr>
+          <w:rFonts w:ascii="Arial" w:eastAsia="Arial" w:hAnsi="Arial" w:cs="Arial"/>
+          <w:bCs/>
+          <w:sz w:val="22"/>
+          <w:szCs w:val="22"/>
+          <w:lang w:val="en"/>
+        </w:rPr>
+        <w:t>PyMuPDF</w:t>
+      </w:r>
+      <w:proofErr w:type="spellEnd"/>
+      <w:r>
+        <w:rPr>
+          <w:rFonts w:ascii="Arial" w:eastAsia="Arial" w:hAnsi="Arial" w:cs="Arial"/>
+          <w:bCs/>
+          <w:sz w:val="22"/>
+          <w:szCs w:val="22"/>
+          <w:lang w:val="en"/>
+        </w:rPr>
+        <w:t>, and SQLite, the system ensures secure handling of sensitive information while enabling rapid review and decision-making. This project significantly reduces manual effort and accelerates document understanding in high-volume legal workflows.</w:t>
+      </w:r>
+    </w:p>
+    <w:p>
+      <w:pPr>
+        <w:pStyle w:val="p1"/>
+        <w:numPr>
+          <w:ilvl w:val="0"/>
+          <w:numId w:val="2"/>
+        </w:numPr>
+        <w:rPr>
+          <w:rFonts w:ascii="Arial" w:eastAsia="Arial" w:hAnsi="Arial" w:cs="Arial"/>
+          <w:bCs/>
+          <w:sz w:val="22"/>
+          <w:szCs w:val="22"/>
+          <w:lang w:val="en"/>
+        </w:rPr>
+      </w:pPr>
+      <w:r>
+        <w:rPr>
+          <w:rFonts w:ascii="Arial" w:eastAsia="Arial" w:hAnsi="Arial" w:cs="Arial"/>
+          <w:bCs/>
+          <w:sz w:val="22"/>
+          <w:szCs w:val="22"/>
+          <w:lang w:val="en"/>
+        </w:rPr>
+        <w:t xml:space="preserve">Axis </w:t>
+      </w:r>
+      <w:proofErr w:type="spellStart"/>
+      <w:r>
+        <w:rPr>
+          <w:rFonts w:ascii="Arial" w:eastAsia="Arial" w:hAnsi="Arial" w:cs="Arial"/>
+          <w:bCs/>
+          <w:sz w:val="22"/>
+          <w:szCs w:val="22"/>
+          <w:lang w:val="en"/>
+        </w:rPr>
+        <w:t>Maxlife</w:t>
+      </w:r>
+      <w:proofErr w:type="spellEnd"/>
+      <w:r>
+        <w:rPr>
+          <w:rFonts w:ascii="Arial" w:eastAsia="Arial" w:hAnsi="Arial" w:cs="Arial"/>
+          <w:bCs/>
+          <w:sz w:val="22"/>
+          <w:szCs w:val="22"/>
+          <w:lang w:val="en"/>
+        </w:rPr>
+        <w:t xml:space="preserve"> Chatbot - Currently leading the development of an AI-powered, agentic SQL chatbot for Axis Max Life using </w:t>
+      </w:r>
+      <w:proofErr w:type="spellStart"/>
+      <w:r>
+        <w:rPr>
+          <w:rFonts w:ascii="Arial" w:eastAsia="Arial" w:hAnsi="Arial" w:cs="Arial"/>
+          <w:sz w:val="22"/>
+          <w:szCs w:val="22"/>
+          <w:lang w:val="en"/>
+        </w:rPr>
+        <w:t>LangGraph</w:t>
+      </w:r>
+      <w:proofErr w:type="spellEnd"/>
+      <w:r>
+        <w:rPr>
+          <w:rFonts w:ascii="Arial" w:eastAsia="Arial" w:hAnsi="Arial" w:cs="Arial"/>
+          <w:bCs/>
+          <w:sz w:val="22"/>
+          <w:szCs w:val="22"/>
+          <w:lang w:val="en"/>
+        </w:rPr>
+        <w:t xml:space="preserve"> to orchestrate multi-step reasoning and chain-of-thought execution. The chatbot leverages </w:t>
+      </w:r>
+      <w:r>
+        <w:rPr>
+          <w:rFonts w:ascii="Arial" w:eastAsia="Arial" w:hAnsi="Arial" w:cs="Arial"/>
+          <w:sz w:val="22"/>
+          <w:szCs w:val="22"/>
+          <w:lang w:val="en"/>
+        </w:rPr>
+        <w:t>GPT-4o</w:t>
+      </w:r>
+      <w:r>
+        <w:rPr>
+          <w:rFonts w:ascii="Arial" w:eastAsia="Arial" w:hAnsi="Arial" w:cs="Arial"/>
+          <w:bCs/>
+          <w:sz w:val="22"/>
+          <w:szCs w:val="22"/>
+          <w:lang w:val="en"/>
+        </w:rPr>
+        <w:t xml:space="preserve"> to convert natural language queries into optimized SQL, querying a secure replica of the Redshift database. Built with </w:t>
+      </w:r>
+      <w:proofErr w:type="spellStart"/>
+      <w:r>
+        <w:rPr>
+          <w:rFonts w:ascii="Arial" w:eastAsia="Arial" w:hAnsi="Arial" w:cs="Arial"/>
+          <w:sz w:val="22"/>
+          <w:szCs w:val="22"/>
+          <w:lang w:val="en"/>
+        </w:rPr>
+        <w:t>FastAPI</w:t>
+      </w:r>
+      <w:proofErr w:type="spellEnd"/>
+      <w:r>
+        <w:rPr>
+          <w:rFonts w:ascii="Arial" w:eastAsia="Arial" w:hAnsi="Arial" w:cs="Arial"/>
+          <w:bCs/>
+          <w:sz w:val="22"/>
+          <w:szCs w:val="22"/>
+          <w:lang w:val="en"/>
+        </w:rPr>
+        <w:t xml:space="preserve"> and </w:t>
+      </w:r>
+      <w:proofErr w:type="spellStart"/>
+      <w:r>
+        <w:rPr>
+          <w:rFonts w:ascii="Arial" w:eastAsia="Arial" w:hAnsi="Arial" w:cs="Arial"/>
+          <w:sz w:val="22"/>
+          <w:szCs w:val="22"/>
+          <w:lang w:val="en"/>
+        </w:rPr>
+        <w:t>Streamlit</w:t>
+      </w:r>
+      <w:proofErr w:type="spellEnd"/>
+      <w:r>
+        <w:rPr>
+          <w:rFonts w:ascii="Arial" w:eastAsia="Arial" w:hAnsi="Arial" w:cs="Arial"/>
+          <w:bCs/>
+          <w:sz w:val="22"/>
+          <w:szCs w:val="22"/>
+          <w:lang w:val="en"/>
+        </w:rPr>
+        <w:t xml:space="preserve">, the solution supports contextual conversations, daily PDF performance reports, anomaly detection, and personalized recommendations for underperforming agents. By integrating agentic workflows and memory, the system enables dynamic, interactive analytics and empowers business users to gain insights </w:t>
+      </w:r>
+      <w:r>
+        <w:rPr>
+          <w:rFonts w:ascii="Arial" w:eastAsia="Arial" w:hAnsi="Arial" w:cs="Arial"/>
+          <w:bCs/>
+          <w:sz w:val="22"/>
+          <w:szCs w:val="22"/>
+          <w:lang w:val="en"/>
+        </w:rPr>
+        <w:lastRenderedPageBreak/>
+        <w:t>without technical expertise—streamlining performance monitoring and strategic decision-making.</w:t>
+      </w:r>
+    </w:p>
     <w:p/>
     <w:p>
       <w:r>
@@ -723,132 +1640,292 @@
         <w:t>HR policy documents</w:t>
       </w:r>
       <w:r>
-        <w:t xml:space="preserve"> via WhatsApp, </w:t>
-      </w:r>
-      <w:r>
+        <w:t xml:space="preserve"> via WhatsApp, providing instant responses using </w:t>
+      </w:r>
+      <w:r>
+        <w:rPr>
+          <w:b/>
+        </w:rPr>
+        <w:t>retrieval-augmented generation (RAG)</w:t>
+      </w:r>
+      <w:r>
+        <w:t xml:space="preserve">. It is integrated with a </w:t>
+      </w:r>
+      <w:r>
+        <w:rPr>
+          <w:b/>
+        </w:rPr>
+        <w:t>Meta Business Account</w:t>
+      </w:r>
+      <w:r>
+        <w:t xml:space="preserve"> for seamless messaging and leverages </w:t>
+      </w:r>
+      <w:r>
+        <w:rPr>
+          <w:b/>
+        </w:rPr>
+        <w:t>LLM-based text processing</w:t>
+      </w:r>
+      <w:r>
+        <w:t xml:space="preserve"> to extract and retrieve relevant information. The system is optimized for </w:t>
+      </w:r>
+      <w:r>
+        <w:rPr>
+          <w:b/>
+        </w:rPr>
+        <w:t>secure document handling, cost-efficient storage (S3), and real-time query resolution</w:t>
+      </w:r>
+      <w:r>
+        <w:t>.</w:t>
+      </w:r>
+    </w:p>
+    <w:p>
+      <w:pPr>
+        <w:numPr>
+          <w:ilvl w:val="0"/>
+          <w:numId w:val="2"/>
+        </w:numPr>
+      </w:pPr>
+      <w:r>
+        <w:t xml:space="preserve">JIRA ticket classification - </w:t>
+      </w:r>
+      <w:r>
+        <w:rPr>
+          <w:b/>
+        </w:rPr>
+        <w:t>JIRA Ticket Classification</w:t>
+      </w:r>
+      <w:r>
+        <w:t xml:space="preserve"> is an AI-powered system that automatically categorizes </w:t>
+      </w:r>
+      <w:r>
+        <w:rPr>
+          <w:b/>
+        </w:rPr>
+        <w:t>JIRA tickets</w:t>
+      </w:r>
+      <w:r>
+        <w:t xml:space="preserve"> based on </w:t>
+      </w:r>
+      <w:r>
+        <w:rPr>
+          <w:b/>
+        </w:rPr>
+        <w:t>priority, type, and issue category</w:t>
+      </w:r>
+      <w:r>
+        <w:t xml:space="preserve"> using </w:t>
+      </w:r>
+      <w:r>
+        <w:rPr>
+          <w:b/>
+        </w:rPr>
+        <w:t>Natural Language Processing (NLP) and Machine Learning</w:t>
+      </w:r>
+      <w:r>
+        <w:t xml:space="preserve">. It enhances workflow efficiency by leveraging </w:t>
+      </w:r>
+      <w:r>
+        <w:rPr>
+          <w:b/>
+        </w:rPr>
+        <w:t>GPT-4o</w:t>
+      </w:r>
+      <w:r>
+        <w:t xml:space="preserve"> for intelligent classification and integrates with </w:t>
+      </w:r>
+      <w:r>
+        <w:rPr>
+          <w:b/>
+        </w:rPr>
+        <w:t>JIRA APIs</w:t>
+      </w:r>
+      <w:r>
+        <w:t xml:space="preserve"> for seamless automation. The system improves </w:t>
+      </w:r>
+      <w:r>
+        <w:rPr>
+          <w:b/>
+        </w:rPr>
+        <w:t>ticket triaging, response times, and resource allocation</w:t>
+      </w:r>
+      <w:r>
+        <w:t xml:space="preserve"> by ensuring accurate tagging and prioritization.</w:t>
+      </w:r>
+    </w:p>
+    <w:p/>
+    <w:p>
+      <w:proofErr w:type="spellStart"/>
+      <w:r>
+        <w:t>Highradius</w:t>
+      </w:r>
+      <w:proofErr w:type="spellEnd"/>
+      <w:r>
+        <w:t xml:space="preserve"> Technology - </w:t>
+      </w:r>
+    </w:p>
+    <w:p>
+      <w:pPr>
+        <w:numPr>
+          <w:ilvl w:val="0"/>
+          <w:numId w:val="5"/>
+        </w:numPr>
+      </w:pPr>
+      <w:proofErr w:type="spellStart"/>
+      <w:r>
+        <w:t>AutoPh</w:t>
+      </w:r>
+      <w:proofErr w:type="spellEnd"/>
+      <w:r>
+        <w:t xml:space="preserve"> - an </w:t>
+      </w:r>
+      <w:r>
+        <w:rPr>
+          <w:b/>
+        </w:rPr>
+        <w:t>automated employee performance evaluation system</w:t>
+      </w:r>
+      <w:r>
+        <w:t xml:space="preserve"> that utilizes a </w:t>
+      </w:r>
+      <w:r>
+        <w:rPr>
+          <w:b/>
+        </w:rPr>
+        <w:t>RAG-based model</w:t>
+      </w:r>
+      <w:r>
+        <w:t xml:space="preserve"> to analyze and assess employee performance metrics. It is designed for </w:t>
+      </w:r>
+      <w:r>
+        <w:rPr>
+          <w:b/>
+        </w:rPr>
+        <w:t>data-driven employee lifecycle management</w:t>
+      </w:r>
+      <w:r>
+        <w:t xml:space="preserve">, leveraging AI to provide </w:t>
+      </w:r>
+      <w:r>
+        <w:rPr>
+          <w:b/>
+        </w:rPr>
+        <w:t>objective insights, performance tracking, and predictive analytics</w:t>
+      </w:r>
+      <w:r>
+        <w:t xml:space="preserve"> for HR decision-making. The system enhances </w:t>
+      </w:r>
+      <w:r>
+        <w:rPr>
+          <w:b/>
+        </w:rPr>
+        <w:t>workforce efficiency, career progression planning, and fair performance assessments</w:t>
+      </w:r>
+      <w:r>
+        <w:t xml:space="preserve"> based on real-time data.</w:t>
+      </w:r>
+    </w:p>
+    <w:p>
+      <w:pPr>
+        <w:numPr>
+          <w:ilvl w:val="0"/>
+          <w:numId w:val="5"/>
+        </w:numPr>
+      </w:pPr>
+      <w:r>
+        <w:t xml:space="preserve">Automated Custom Prompting - a </w:t>
+      </w:r>
+      <w:r>
+        <w:rPr>
+          <w:b/>
+        </w:rPr>
+        <w:t>GPT-4 Turbo-powered</w:t>
+      </w:r>
+      <w:r>
+        <w:t xml:space="preserve"> system that dynamically generates optimized prompts using </w:t>
+      </w:r>
+      <w:r>
+        <w:rPr>
+          <w:b/>
+        </w:rPr>
+        <w:t>advanced prompt engineering techniques</w:t>
+      </w:r>
+      <w:r>
+        <w:t xml:space="preserve">. It enhances </w:t>
+      </w:r>
+      <w:r>
+        <w:rPr>
+          <w:b/>
+        </w:rPr>
+        <w:t>LLM response accuracy, consistency, and efficiency</w:t>
+      </w:r>
+      <w:r>
+        <w:t xml:space="preserve"> by tailoring prompts based on context and user intent. The system automates </w:t>
+      </w:r>
+      <w:r>
+        <w:rPr>
+          <w:b/>
+        </w:rPr>
+        <w:t>query refinement, structured prompt generation, and iterative improvements</w:t>
+      </w:r>
+      <w:r>
+        <w:t xml:space="preserve"> to maximize model performance across various applications. </w:t>
+      </w:r>
+    </w:p>
+    <w:p>
+      <w:pPr>
+        <w:numPr>
+          <w:ilvl w:val="0"/>
+          <w:numId w:val="5"/>
+        </w:numPr>
+      </w:pPr>
+      <w:r>
+        <w:t xml:space="preserve">Zoom call summarization - An </w:t>
+      </w:r>
+      <w:r>
+        <w:rPr>
+          <w:b/>
+        </w:rPr>
+        <w:t>in-house project</w:t>
+      </w:r>
+      <w:r>
+        <w:t xml:space="preserve"> that leverages the </w:t>
+      </w:r>
+      <w:proofErr w:type="spellStart"/>
+      <w:r>
+        <w:rPr>
+          <w:b/>
+        </w:rPr>
+        <w:t>LLaMA</w:t>
+      </w:r>
+      <w:proofErr w:type="spellEnd"/>
+      <w:r>
+        <w:rPr>
+          <w:b/>
+        </w:rPr>
+        <w:t xml:space="preserve"> model</w:t>
+      </w:r>
+      <w:r>
+        <w:t xml:space="preserve"> to generate structured summaries of Zoom meetings, highlighting key discussion points and action items. It processes </w:t>
+      </w:r>
+      <w:r>
+        <w:rPr>
+          <w:b/>
+        </w:rPr>
+        <w:t>transcripts and extracts critical insights</w:t>
+      </w:r>
+      <w:r>
+        <w:t xml:space="preserve">, ensuring concise and accurate reporting for better decision-making. The system enhances </w:t>
+      </w:r>
+      <w:r>
+        <w:rPr>
+          <w:b/>
+        </w:rPr>
         <w:lastRenderedPageBreak/>
-        <w:t xml:space="preserve">providing instant responses using </w:t>
-      </w:r>
-      <w:r>
-        <w:rPr>
-          <w:b/>
-        </w:rPr>
-        <w:t>retrieval-augmented generation (RAG)</w:t>
-      </w:r>
-      <w:r>
-        <w:t xml:space="preserve">. It is integrated with a </w:t>
-      </w:r>
-      <w:r>
-        <w:rPr>
-          <w:b/>
-        </w:rPr>
-        <w:t>Meta Business Account</w:t>
-      </w:r>
-      <w:r>
-        <w:t xml:space="preserve"> for seamless messaging and leverages </w:t>
-      </w:r>
-      <w:r>
-        <w:rPr>
-          <w:b/>
-        </w:rPr>
-        <w:t>LLM-based text processing</w:t>
-      </w:r>
-      <w:r>
-        <w:t xml:space="preserve"> to extract and retrieve relevant information. The system is optimized for </w:t>
-      </w:r>
-      <w:r>
-        <w:rPr>
-          <w:b/>
-        </w:rPr>
-        <w:t>secure document handling, cost-efficient storage (S3), and real-time query resolution</w:t>
-      </w:r>
-      <w:r>
-        <w:t>.</w:t>
-      </w:r>
-    </w:p>
-    <w:p>
-      <w:pPr>
-        <w:numPr>
-          <w:ilvl w:val="0"/>
-          <w:numId w:val="2"/>
-        </w:numPr>
-      </w:pPr>
-      <w:r>
-        <w:t xml:space="preserve">JIRA ticket classification - </w:t>
-      </w:r>
-      <w:r>
-        <w:rPr>
-          <w:b/>
-        </w:rPr>
-        <w:t>JIRA Ticket Classification</w:t>
-      </w:r>
-      <w:r>
-        <w:t xml:space="preserve"> is an AI-powered system that automatically categorizes </w:t>
-      </w:r>
-      <w:r>
-        <w:rPr>
-          <w:b/>
-        </w:rPr>
-        <w:t>JIRA tickets</w:t>
-      </w:r>
-      <w:r>
-        <w:t xml:space="preserve"> based on </w:t>
-      </w:r>
-      <w:r>
-        <w:rPr>
-          <w:b/>
-        </w:rPr>
-        <w:t>priority, type, and issue category</w:t>
-      </w:r>
-      <w:r>
-        <w:t xml:space="preserve"> using </w:t>
-      </w:r>
-      <w:r>
-        <w:rPr>
-          <w:b/>
-        </w:rPr>
-        <w:t>Natural Language Processing (NLP) and Machine Learning</w:t>
-      </w:r>
-      <w:r>
-        <w:t xml:space="preserve">. It enhances workflow efficiency by leveraging </w:t>
-      </w:r>
-      <w:r>
-        <w:rPr>
-          <w:b/>
-        </w:rPr>
-        <w:t>GPT-4o</w:t>
-      </w:r>
-      <w:r>
-        <w:t xml:space="preserve"> for intelligent classification and integrates with </w:t>
-      </w:r>
-      <w:r>
-        <w:rPr>
-          <w:b/>
-        </w:rPr>
-        <w:t>JIRA APIs</w:t>
-      </w:r>
-      <w:r>
-        <w:t xml:space="preserve"> for seamless automation. The system improves </w:t>
-      </w:r>
-      <w:r>
-        <w:rPr>
-          <w:b/>
-        </w:rPr>
-        <w:t>ticket triaging, response times, and resource allocation</w:t>
-      </w:r>
-      <w:r>
-        <w:t xml:space="preserve"> by ensuring accurate tagging and prioritization.</w:t>
-      </w:r>
-    </w:p>
-    <w:p/>
-    <w:p>
-      <w:proofErr w:type="spellStart"/>
-      <w:r>
-        <w:t>Highradius</w:t>
-      </w:r>
-      <w:proofErr w:type="spellEnd"/>
-      <w:r>
-        <w:t xml:space="preserve"> Technology - </w:t>
+        <w:t>meeting productivity</w:t>
+      </w:r>
+      <w:r>
+        <w:t xml:space="preserve"> by automating report generation and capturing essential aspects of each call. </w:t>
       </w:r>
     </w:p>
     <w:p>
@@ -858,58 +1935,70 @@
           <w:numId w:val="5"/>
         </w:numPr>
       </w:pPr>
-      <w:proofErr w:type="spellStart"/>
-      <w:r>
-        <w:t>AutoPh</w:t>
-      </w:r>
-      <w:proofErr w:type="spellEnd"/>
-      <w:r>
-        <w:t xml:space="preserve"> - an </w:t>
-      </w:r>
-      <w:r>
-        <w:rPr>
-          <w:b/>
-        </w:rPr>
-        <w:t>automated employee performance evaluation system</w:t>
-      </w:r>
-      <w:r>
-        <w:t xml:space="preserve"> that utilizes a </w:t>
-      </w:r>
-      <w:r>
-        <w:rPr>
-          <w:b/>
-        </w:rPr>
-        <w:t>RAG-based model</w:t>
-      </w:r>
-      <w:r>
-        <w:t xml:space="preserve"> to analyze and assess employee performance metrics. It is designed for </w:t>
-      </w:r>
-      <w:r>
-        <w:rPr>
-          <w:b/>
-        </w:rPr>
-        <w:t>data-driven employee lifecycle management</w:t>
-      </w:r>
-      <w:r>
-        <w:t xml:space="preserve">, leveraging AI to provide </w:t>
-      </w:r>
-      <w:r>
-        <w:rPr>
-          <w:b/>
-        </w:rPr>
-        <w:t>objective insights, performance tracking, and predictive analytics</w:t>
-      </w:r>
-      <w:r>
-        <w:t xml:space="preserve"> for HR decision-making. The system enhances </w:t>
-      </w:r>
-      <w:r>
-        <w:rPr>
-          <w:b/>
-        </w:rPr>
-        <w:t>workforce efficiency, career progression planning, and fair performance assessments</w:t>
-      </w:r>
-      <w:r>
-        <w:t xml:space="preserve"> based on real-time data.</w:t>
+      <w:r>
+        <w:t xml:space="preserve">Block Order Release Recommendation (BORR) - a </w:t>
+      </w:r>
+      <w:proofErr w:type="spellStart"/>
+      <w:r>
+        <w:rPr>
+          <w:b/>
+        </w:rPr>
+        <w:t>HighRadius</w:t>
+      </w:r>
+      <w:proofErr w:type="spellEnd"/>
+      <w:r>
+        <w:rPr>
+          <w:b/>
+        </w:rPr>
+        <w:t xml:space="preserve"> credit product</w:t>
+      </w:r>
+      <w:r>
+        <w:t xml:space="preserve"> designed to assist </w:t>
+      </w:r>
+      <w:r>
+        <w:rPr>
+          <w:b/>
+        </w:rPr>
+        <w:t>credit analysts</w:t>
+      </w:r>
+      <w:r>
+        <w:t xml:space="preserve"> in making data-driven decisions on whether to </w:t>
+      </w:r>
+      <w:r>
+        <w:rPr>
+          <w:b/>
+        </w:rPr>
+        <w:t>block or release customer orders</w:t>
+      </w:r>
+      <w:r>
+        <w:t xml:space="preserve">. It leverages </w:t>
+      </w:r>
+      <w:r>
+        <w:rPr>
+          <w:b/>
+        </w:rPr>
+        <w:t>AI-driven risk assessment models</w:t>
+      </w:r>
+      <w:r>
+        <w:t xml:space="preserve"> to analyze </w:t>
+      </w:r>
+      <w:r>
+        <w:rPr>
+          <w:b/>
+        </w:rPr>
+        <w:t>customer creditworthiness, payment history, and financial trends</w:t>
+      </w:r>
+      <w:r>
+        <w:t xml:space="preserve"> in real time. This system enhances </w:t>
+      </w:r>
+      <w:r>
+        <w:rPr>
+          <w:b/>
+        </w:rPr>
+        <w:t>order management efficiency, reduces credit risk, and optimizes cash flow</w:t>
+      </w:r>
+      <w:r>
+        <w:t xml:space="preserve"> by providing intelligent, automated recommendations. </w:t>
       </w:r>
     </w:p>
     <w:p>
@@ -920,43 +2009,69 @@
         </w:numPr>
       </w:pPr>
       <w:r>
-        <w:t xml:space="preserve">Automated Custom Prompting - a </w:t>
-      </w:r>
-      <w:r>
-        <w:rPr>
-          <w:b/>
-        </w:rPr>
-        <w:t>GPT-4 Turbo-powered</w:t>
-      </w:r>
-      <w:r>
-        <w:t xml:space="preserve"> system that dynamically generates optimized prompts using </w:t>
-      </w:r>
-      <w:r>
-        <w:rPr>
-          <w:b/>
-        </w:rPr>
-        <w:t>advanced prompt engineering techniques</w:t>
-      </w:r>
-      <w:r>
-        <w:t xml:space="preserve">. It enhances </w:t>
-      </w:r>
-      <w:r>
-        <w:rPr>
-          <w:b/>
-        </w:rPr>
-        <w:t>LLM response accuracy, consistency, and efficiency</w:t>
-      </w:r>
-      <w:r>
-        <w:t xml:space="preserve"> by tailoring prompts based on context and user intent. The system automates </w:t>
-      </w:r>
-      <w:r>
-        <w:rPr>
-          <w:b/>
-        </w:rPr>
-        <w:t>query refinement, structured prompt generation, and iterative improvements</w:t>
-      </w:r>
-      <w:r>
-        <w:t xml:space="preserve"> to maximize model performance across various applications. </w:t>
+        <w:t xml:space="preserve">Proactive Block Order Prediction (PBOP) - a </w:t>
+      </w:r>
+      <w:proofErr w:type="spellStart"/>
+      <w:r>
+        <w:rPr>
+          <w:b/>
+        </w:rPr>
+        <w:t>HighRadius</w:t>
+      </w:r>
+      <w:proofErr w:type="spellEnd"/>
+      <w:r>
+        <w:rPr>
+          <w:b/>
+        </w:rPr>
+        <w:t xml:space="preserve"> credit product</w:t>
+      </w:r>
+      <w:r>
+        <w:t xml:space="preserve"> that provides </w:t>
+      </w:r>
+      <w:r>
+        <w:rPr>
+          <w:b/>
+        </w:rPr>
+        <w:t>credit analysts</w:t>
+      </w:r>
+      <w:r>
+        <w:t xml:space="preserve"> with </w:t>
+      </w:r>
+      <w:r>
+        <w:rPr>
+          <w:b/>
+        </w:rPr>
+        <w:t>AI-driven proactive recommendations</w:t>
+      </w:r>
+      <w:r>
+        <w:t xml:space="preserve"> on whether to </w:t>
+      </w:r>
+      <w:r>
+        <w:rPr>
+          <w:b/>
+        </w:rPr>
+        <w:t>block or release an order even before it is placed</w:t>
+      </w:r>
+      <w:r>
+        <w:t xml:space="preserve">. It leverages </w:t>
+      </w:r>
+      <w:r>
+        <w:rPr>
+          <w:b/>
+        </w:rPr>
+        <w:t>predictive analytics, customer credit risk modeling, and historical transaction patterns</w:t>
+      </w:r>
+      <w:r>
+        <w:t xml:space="preserve"> to anticipate potential credit issues in advance. This system helps businesses </w:t>
+      </w:r>
+      <w:r>
+        <w:rPr>
+          <w:b/>
+        </w:rPr>
+        <w:t>mitigate financial risks, optimize order processing, and improve decision-making efficiency</w:t>
+      </w:r>
+      <w:r>
+        <w:t xml:space="preserve"> in real-time.</w:t>
       </w:r>
     </w:p>
     <w:p>
@@ -967,51 +2082,69 @@
         </w:numPr>
       </w:pPr>
       <w:r>
-        <w:t xml:space="preserve">Zoom call summarization - An </w:t>
-      </w:r>
-      <w:r>
-        <w:rPr>
-          <w:b/>
-        </w:rPr>
-        <w:t>in-house project</w:t>
-      </w:r>
-      <w:r>
-        <w:t xml:space="preserve"> that leverages the </w:t>
-      </w:r>
-      <w:proofErr w:type="spellStart"/>
-      <w:r>
-        <w:rPr>
-          <w:b/>
-        </w:rPr>
-        <w:t>LLaMA</w:t>
-      </w:r>
-      <w:proofErr w:type="spellEnd"/>
-      <w:r>
-        <w:rPr>
-          <w:b/>
-        </w:rPr>
-        <w:t xml:space="preserve"> model</w:t>
-      </w:r>
-      <w:r>
-        <w:t xml:space="preserve"> to generate structured summaries of Zoom meetings, highlighting key discussion points and action items. It processes </w:t>
-      </w:r>
-      <w:r>
-        <w:rPr>
-          <w:b/>
-        </w:rPr>
-        <w:t>transcripts and extracts critical insights</w:t>
-      </w:r>
-      <w:r>
-        <w:t xml:space="preserve">, ensuring concise and accurate reporting for better decision-making. The system enhances </w:t>
-      </w:r>
-      <w:r>
-        <w:rPr>
-          <w:b/>
-        </w:rPr>
-        <w:t>meeting productivity</w:t>
-      </w:r>
-      <w:r>
-        <w:t xml:space="preserve"> by automating report generation and capturing essential aspects of each call. </w:t>
+        <w:t xml:space="preserve">Deduction Validity Predictor (DVP) - a </w:t>
+      </w:r>
+      <w:proofErr w:type="spellStart"/>
+      <w:r>
+        <w:rPr>
+          <w:b/>
+        </w:rPr>
+        <w:t>HighRadius</w:t>
+      </w:r>
+      <w:proofErr w:type="spellEnd"/>
+      <w:r>
+        <w:rPr>
+          <w:b/>
+        </w:rPr>
+        <w:t xml:space="preserve"> deduction product</w:t>
+      </w:r>
+      <w:r>
+        <w:t xml:space="preserve"> that leverages </w:t>
+      </w:r>
+      <w:r>
+        <w:rPr>
+          <w:b/>
+        </w:rPr>
+        <w:t>machine learning algorithms</w:t>
+      </w:r>
+      <w:r>
+        <w:t xml:space="preserve"> to determine the </w:t>
+      </w:r>
+      <w:r>
+        <w:rPr>
+          <w:b/>
+        </w:rPr>
+        <w:t>validity of customer deductions</w:t>
+      </w:r>
+      <w:r>
+        <w:t xml:space="preserve"> in real-time. It analyzes </w:t>
+      </w:r>
+      <w:r>
+        <w:rPr>
+          <w:b/>
+        </w:rPr>
+        <w:t>historical claims, transaction patterns, and reason codes</w:t>
+      </w:r>
+      <w:r>
+        <w:t xml:space="preserve"> to predict whether a deduction is </w:t>
+      </w:r>
+      <w:r>
+        <w:rPr>
+          <w:b/>
+        </w:rPr>
+        <w:t>valid or invalid</w:t>
+      </w:r>
+      <w:r>
+        <w:t xml:space="preserve">, reducing manual effort for analysts. This system enhances </w:t>
+      </w:r>
+      <w:r>
+        <w:rPr>
+          <w:b/>
+        </w:rPr>
+        <w:t>dispute resolution efficiency, minimizes revenue leakage, and accelerates deduction processing</w:t>
+      </w:r>
+      <w:r>
+        <w:t xml:space="preserve"> with data-driven insights.</w:t>
       </w:r>
     </w:p>
     <w:p>
@@ -1022,7 +2155,7 @@
         </w:numPr>
       </w:pPr>
       <w:r>
-        <w:t xml:space="preserve">Block Order Release Recommendation (BORR) - a </w:t>
+        <w:t xml:space="preserve">Payment Data Prediction (PDP) - </w:t>
       </w:r>
       <w:proofErr w:type="spellStart"/>
       <w:r>
@@ -1036,276 +2169,263 @@
         <w:rPr>
           <w:b/>
         </w:rPr>
-        <w:t xml:space="preserve"> credit product</w:t>
-      </w:r>
-      <w:r>
-        <w:t xml:space="preserve"> designed to assist </w:t>
-      </w:r>
-      <w:r>
-        <w:rPr>
-          <w:b/>
-        </w:rPr>
-        <w:t>credit analysts</w:t>
-      </w:r>
-      <w:r>
-        <w:t xml:space="preserve"> in making data-driven decisions on whether to </w:t>
-      </w:r>
-      <w:r>
-        <w:rPr>
-          <w:b/>
-        </w:rPr>
-        <w:t>block or release customer orders</w:t>
-      </w:r>
-      <w:r>
-        <w:t xml:space="preserve">. It leverages </w:t>
-      </w:r>
-      <w:r>
-        <w:rPr>
-          <w:b/>
-        </w:rPr>
-        <w:t>AI-driven risk assessment models</w:t>
-      </w:r>
-      <w:r>
-        <w:t xml:space="preserve"> to analyze </w:t>
-      </w:r>
-      <w:r>
-        <w:rPr>
-          <w:b/>
-        </w:rPr>
-        <w:t>customer creditworthiness, payment history, and financial trends</w:t>
-      </w:r>
-      <w:r>
-        <w:t xml:space="preserve"> in real time. This system enhances </w:t>
-      </w:r>
-      <w:r>
-        <w:rPr>
-          <w:b/>
-        </w:rPr>
-        <w:t>order management efficiency, reduces credit risk, and optimizes cash flow</w:t>
-      </w:r>
-      <w:r>
-        <w:t xml:space="preserve"> by providing intelligent, automated recommendations. </w:t>
-      </w:r>
-    </w:p>
-    <w:p>
-      <w:pPr>
-        <w:numPr>
-          <w:ilvl w:val="0"/>
-          <w:numId w:val="5"/>
-        </w:numPr>
-      </w:pPr>
-      <w:r>
-        <w:t xml:space="preserve">Proactive Block Order Prediction (PBOP) - a </w:t>
-      </w:r>
-      <w:proofErr w:type="spellStart"/>
-      <w:r>
-        <w:rPr>
-          <w:b/>
-        </w:rPr>
-        <w:t>HighRadius</w:t>
-      </w:r>
-      <w:proofErr w:type="spellEnd"/>
-      <w:r>
-        <w:rPr>
-          <w:b/>
-        </w:rPr>
-        <w:t xml:space="preserve"> credit product</w:t>
-      </w:r>
-      <w:r>
-        <w:t xml:space="preserve"> that provides </w:t>
-      </w:r>
-      <w:r>
-        <w:rPr>
-          <w:b/>
-        </w:rPr>
-        <w:t>credit analysts</w:t>
-      </w:r>
-      <w:r>
-        <w:t xml:space="preserve"> with </w:t>
-      </w:r>
-      <w:r>
-        <w:rPr>
-          <w:b/>
-        </w:rPr>
-        <w:t>AI-driven proactive recommendations</w:t>
-      </w:r>
-      <w:r>
-        <w:t xml:space="preserve"> on whether to </w:t>
-      </w:r>
-      <w:r>
-        <w:rPr>
-          <w:b/>
-        </w:rPr>
-        <w:t>block or release an order even before it is placed</w:t>
-      </w:r>
-      <w:r>
-        <w:t xml:space="preserve">. It leverages </w:t>
-      </w:r>
-      <w:r>
-        <w:rPr>
-          <w:b/>
-        </w:rPr>
-        <w:t>predictive analytics, customer credit risk modeling, and historical transaction patterns</w:t>
-      </w:r>
-      <w:r>
-        <w:t xml:space="preserve"> to anticipate potential credit issues in advance. This system helps businesses </w:t>
-      </w:r>
-      <w:r>
-        <w:rPr>
-          <w:b/>
-        </w:rPr>
-        <w:t>mitigate financial risks, optimize order processing, and improve decision-making efficiency</w:t>
-      </w:r>
-      <w:r>
-        <w:t xml:space="preserve"> in real-time.</w:t>
-      </w:r>
-    </w:p>
-    <w:p>
-      <w:pPr>
-        <w:numPr>
-          <w:ilvl w:val="0"/>
-          <w:numId w:val="5"/>
+        <w:t xml:space="preserve"> collections product</w:t>
+      </w:r>
+      <w:r>
+        <w:t xml:space="preserve"> that utilizes </w:t>
+      </w:r>
+      <w:r>
+        <w:rPr>
+          <w:b/>
+        </w:rPr>
+        <w:t>AI-powered algorithms</w:t>
+      </w:r>
+      <w:r>
+        <w:t xml:space="preserve"> to predict the </w:t>
+      </w:r>
+      <w:r>
+        <w:rPr>
+          <w:b/>
+        </w:rPr>
+        <w:t>tentative payment date</w:t>
+      </w:r>
+      <w:r>
+        <w:t xml:space="preserve"> for outstanding invoices. It analyzes </w:t>
+      </w:r>
+      <w:r>
+        <w:rPr>
+          <w:b/>
+        </w:rPr>
+        <w:t>customer payment behaviors, historical trends, and financial data</w:t>
+      </w:r>
+      <w:r>
+        <w:t xml:space="preserve"> to provide accurate payment forecasts. This system helps businesses </w:t>
+      </w:r>
+      <w:r>
+        <w:rPr>
+          <w:b/>
+        </w:rPr>
+        <w:t>optimize cash flow, improve collections efficiency, and reduce overdue payments</w:t>
+      </w:r>
+      <w:r>
+        <w:t xml:space="preserve"> with proactive insights.</w:t>
+      </w:r>
+    </w:p>
+    <w:p>
+      <w:pPr>
+        <w:ind w:left="720"/>
+      </w:pPr>
+    </w:p>
+    <w:p>
+      <w:r>
+        <w:t xml:space="preserve">Volunteer Work - </w:t>
+      </w:r>
+    </w:p>
+    <w:p>
+      <w:pPr>
+        <w:numPr>
+          <w:ilvl w:val="0"/>
+          <w:numId w:val="4"/>
+        </w:numPr>
+      </w:pPr>
+      <w:r>
+        <w:t xml:space="preserve">Product Management - </w:t>
+      </w:r>
+      <w:r>
+        <w:rPr>
+          <w:b/>
+        </w:rPr>
+        <w:t>JIRA Handling</w:t>
+      </w:r>
+      <w:r>
+        <w:t xml:space="preserve"> involves </w:t>
+      </w:r>
+      <w:r>
+        <w:rPr>
+          <w:b/>
+        </w:rPr>
+        <w:t>managing and streamlining JIRA workflows</w:t>
+      </w:r>
+      <w:r>
+        <w:t xml:space="preserve"> for a team of </w:t>
+      </w:r>
+      <w:r>
+        <w:rPr>
+          <w:b/>
+        </w:rPr>
+        <w:t>10 members</w:t>
+      </w:r>
+      <w:r>
+        <w:t xml:space="preserve">, ensuring efficient </w:t>
+      </w:r>
+      <w:r>
+        <w:rPr>
+          <w:b/>
+        </w:rPr>
+        <w:t>task tracking, backlog management, and sprint planning</w:t>
+      </w:r>
+      <w:r>
+        <w:t xml:space="preserve">. It includes </w:t>
+      </w:r>
+      <w:r>
+        <w:rPr>
+          <w:b/>
+        </w:rPr>
+        <w:t>ticket prioritization, issue resolution monitoring, and agile reporting</w:t>
+      </w:r>
+      <w:r>
+        <w:t xml:space="preserve"> to enhance team productivity. This system enables </w:t>
+      </w:r>
+      <w:r>
+        <w:rPr>
+          <w:b/>
+        </w:rPr>
+        <w:t>seamless collaboration, timely project execution, and better visibility into development progress</w:t>
+      </w:r>
+      <w:r>
+        <w:t xml:space="preserve">. </w:t>
+      </w:r>
+    </w:p>
+    <w:p>
+      <w:pPr>
+        <w:numPr>
+          <w:ilvl w:val="0"/>
+          <w:numId w:val="4"/>
+        </w:numPr>
+      </w:pPr>
+      <w:r>
+        <w:t xml:space="preserve">Paid Internship 3 - Conducted </w:t>
+      </w:r>
+      <w:r>
+        <w:rPr>
+          <w:b/>
+        </w:rPr>
+        <w:t>data science and machine learning training</w:t>
+      </w:r>
+      <w:r>
+        <w:t xml:space="preserve"> for </w:t>
+      </w:r>
+      <w:r>
+        <w:rPr>
+          <w:b/>
+        </w:rPr>
+        <w:t>300+ students</w:t>
+      </w:r>
+      <w:r>
+        <w:t xml:space="preserve"> across multiple universities, covering both </w:t>
+      </w:r>
+      <w:r>
+        <w:rPr>
+          <w:b/>
+        </w:rPr>
+        <w:t>theoretical concepts and hands-on projects</w:t>
+      </w:r>
+      <w:r>
+        <w:t xml:space="preserve">. Delivered </w:t>
+      </w:r>
+      <w:r>
+        <w:rPr>
+          <w:b/>
+        </w:rPr>
+        <w:t>interactive offline and online sessions</w:t>
+      </w:r>
+      <w:r>
+        <w:t xml:space="preserve"> to enhance practical skills and industry readiness.</w:t>
+      </w:r>
+    </w:p>
+    <w:p>
+      <w:pPr>
+        <w:numPr>
+          <w:ilvl w:val="0"/>
+          <w:numId w:val="4"/>
+        </w:numPr>
+      </w:pPr>
+      <w:r>
+        <w:t xml:space="preserve">Unpaid Internship 3 - Led </w:t>
+      </w:r>
+      <w:r>
+        <w:rPr>
+          <w:b/>
+        </w:rPr>
+        <w:t>data science upskilling sessions</w:t>
+      </w:r>
+      <w:r>
+        <w:t xml:space="preserve"> for </w:t>
+      </w:r>
+      <w:r>
+        <w:rPr>
+          <w:b/>
+        </w:rPr>
+        <w:t>500+ students</w:t>
+      </w:r>
+      <w:r>
+        <w:t xml:space="preserve">, providing </w:t>
+      </w:r>
+      <w:r>
+        <w:rPr>
+          <w:b/>
+        </w:rPr>
+        <w:t>foundational knowledge in machine learning, data analytics, and Python programming</w:t>
+      </w:r>
+      <w:r>
+        <w:t xml:space="preserve">. Engaged students in </w:t>
+      </w:r>
+      <w:r>
+        <w:rPr>
+          <w:b/>
+        </w:rPr>
+        <w:t>real-world case studies and live coding exercises</w:t>
+      </w:r>
+      <w:r>
+        <w:t xml:space="preserve"> to reinforce learning.</w:t>
+      </w:r>
+    </w:p>
+    <w:p>
+      <w:pPr>
+        <w:numPr>
+          <w:ilvl w:val="0"/>
+          <w:numId w:val="4"/>
         </w:numPr>
       </w:pPr>
       <w:r>
         <w:lastRenderedPageBreak/>
-        <w:t xml:space="preserve">Deduction Validity Predictor (DVP) - a </w:t>
-      </w:r>
-      <w:proofErr w:type="spellStart"/>
-      <w:r>
-        <w:rPr>
-          <w:b/>
-        </w:rPr>
-        <w:t>HighRadius</w:t>
-      </w:r>
-      <w:proofErr w:type="spellEnd"/>
-      <w:r>
-        <w:rPr>
-          <w:b/>
-        </w:rPr>
-        <w:t xml:space="preserve"> deduction product</w:t>
-      </w:r>
-      <w:r>
-        <w:t xml:space="preserve"> that leverages </w:t>
-      </w:r>
-      <w:r>
-        <w:rPr>
-          <w:b/>
-        </w:rPr>
-        <w:t>machine learning algorithms</w:t>
-      </w:r>
-      <w:r>
-        <w:t xml:space="preserve"> to determine the </w:t>
-      </w:r>
-      <w:r>
-        <w:rPr>
-          <w:b/>
-        </w:rPr>
-        <w:t>validity of customer deductions</w:t>
-      </w:r>
-      <w:r>
-        <w:t xml:space="preserve"> in real-time. It analyzes </w:t>
-      </w:r>
-      <w:r>
-        <w:rPr>
-          <w:b/>
-        </w:rPr>
-        <w:t>historical claims, transaction patterns, and reason codes</w:t>
-      </w:r>
-      <w:r>
-        <w:t xml:space="preserve"> to predict whether a deduction is </w:t>
-      </w:r>
-      <w:r>
-        <w:rPr>
-          <w:b/>
-        </w:rPr>
-        <w:t>valid or invalid</w:t>
-      </w:r>
-      <w:r>
-        <w:t xml:space="preserve">, reducing manual effort for analysts. This system enhances </w:t>
-      </w:r>
-      <w:r>
-        <w:rPr>
-          <w:b/>
-        </w:rPr>
-        <w:t>dispute resolution efficiency, minimizes revenue leakage, and accelerates deduction processing</w:t>
-      </w:r>
-      <w:r>
-        <w:t xml:space="preserve"> with data-driven insights.</w:t>
-      </w:r>
-    </w:p>
-    <w:p>
-      <w:pPr>
-        <w:numPr>
-          <w:ilvl w:val="0"/>
-          <w:numId w:val="5"/>
-        </w:numPr>
-      </w:pPr>
-      <w:r>
-        <w:t xml:space="preserve">Payment Data Prediction (PDP) - </w:t>
-      </w:r>
-      <w:proofErr w:type="spellStart"/>
-      <w:r>
-        <w:rPr>
-          <w:b/>
-        </w:rPr>
-        <w:t>HighRadius</w:t>
-      </w:r>
-      <w:proofErr w:type="spellEnd"/>
-      <w:r>
-        <w:rPr>
-          <w:b/>
-        </w:rPr>
-        <w:t xml:space="preserve"> collections product</w:t>
-      </w:r>
-      <w:r>
-        <w:t xml:space="preserve"> that utilizes </w:t>
-      </w:r>
-      <w:r>
-        <w:rPr>
-          <w:b/>
-        </w:rPr>
-        <w:t>AI-powered algorithms</w:t>
-      </w:r>
-      <w:r>
-        <w:t xml:space="preserve"> to predict the </w:t>
-      </w:r>
-      <w:r>
-        <w:rPr>
-          <w:b/>
-        </w:rPr>
-        <w:t>tentative payment date</w:t>
-      </w:r>
-      <w:r>
-        <w:t xml:space="preserve"> for outstanding invoices. It analyzes </w:t>
-      </w:r>
-      <w:r>
-        <w:rPr>
-          <w:b/>
-        </w:rPr>
-        <w:t>customer payment behaviors, historical trends, and financial data</w:t>
-      </w:r>
-      <w:r>
-        <w:t xml:space="preserve"> to provide accurate payment forecasts. This system helps businesses </w:t>
-      </w:r>
-      <w:r>
-        <w:rPr>
-          <w:b/>
-        </w:rPr>
-        <w:t>optimize cash flow, improve collections efficiency, and reduce overdue payments</w:t>
-      </w:r>
-      <w:r>
-        <w:t xml:space="preserve"> with proactive insights.</w:t>
-      </w:r>
-    </w:p>
-    <w:p>
-      <w:pPr>
-        <w:ind w:left="720"/>
-      </w:pPr>
-    </w:p>
-    <w:p>
-      <w:r>
-        <w:t xml:space="preserve">Volunteer Work - </w:t>
+        <w:t xml:space="preserve">Paid internship 2 - Designed and delivered </w:t>
+      </w:r>
+      <w:r>
+        <w:rPr>
+          <w:b/>
+        </w:rPr>
+        <w:t>structured data science training</w:t>
+      </w:r>
+      <w:r>
+        <w:t xml:space="preserve"> for </w:t>
+      </w:r>
+      <w:r>
+        <w:rPr>
+          <w:b/>
+        </w:rPr>
+        <w:t>650+ students</w:t>
+      </w:r>
+      <w:r>
+        <w:t xml:space="preserve">, focusing on </w:t>
+      </w:r>
+      <w:r>
+        <w:rPr>
+          <w:b/>
+        </w:rPr>
+        <w:t>machine learning algorithms, model evaluation, and real-world applications</w:t>
+      </w:r>
+      <w:r>
+        <w:t xml:space="preserve">. Conducted </w:t>
+      </w:r>
+      <w:r>
+        <w:rPr>
+          <w:b/>
+        </w:rPr>
+        <w:t>live Q&amp;A sessions and mentorship</w:t>
+      </w:r>
+      <w:r>
+        <w:t xml:space="preserve"> to ensure deep understanding.</w:t>
       </w:r>
     </w:p>
     <w:p>
@@ -1316,61 +2436,34 @@
         </w:numPr>
       </w:pPr>
       <w:r>
-        <w:t xml:space="preserve">Product Management - </w:t>
-      </w:r>
-      <w:r>
-        <w:rPr>
-          <w:b/>
-        </w:rPr>
-        <w:t>JIRA Handling</w:t>
-      </w:r>
-      <w:r>
-        <w:t xml:space="preserve"> involves </w:t>
-      </w:r>
-      <w:r>
-        <w:rPr>
-          <w:b/>
-        </w:rPr>
-        <w:t>managing and streamlining JIRA workflows</w:t>
-      </w:r>
-      <w:r>
-        <w:t xml:space="preserve"> for a team of </w:t>
-      </w:r>
-      <w:r>
-        <w:rPr>
-          <w:b/>
-        </w:rPr>
-        <w:t>10 members</w:t>
-      </w:r>
-      <w:r>
-        <w:t xml:space="preserve">, ensuring efficient </w:t>
-      </w:r>
-      <w:r>
-        <w:rPr>
-          <w:b/>
-        </w:rPr>
-        <w:t>task tracking, backlog management, and sprint planning</w:t>
-      </w:r>
-      <w:r>
-        <w:t xml:space="preserve">. It includes </w:t>
-      </w:r>
-      <w:r>
-        <w:rPr>
-          <w:b/>
-        </w:rPr>
-        <w:t>ticket prioritization, issue resolution monitoring, and agile reporting</w:t>
-      </w:r>
-      <w:r>
-        <w:t xml:space="preserve"> to enhance team productivity. This system enables </w:t>
-      </w:r>
-      <w:r>
-        <w:rPr>
-          <w:b/>
-        </w:rPr>
-        <w:t>seamless collaboration, timely project execution, and better visibility into development progress</w:t>
-      </w:r>
-      <w:r>
-        <w:t xml:space="preserve">. </w:t>
+        <w:t xml:space="preserve">Unpaid internship 2 - Trained </w:t>
+      </w:r>
+      <w:r>
+        <w:rPr>
+          <w:b/>
+        </w:rPr>
+        <w:t>900+ students in data science and AI fundamentals</w:t>
+      </w:r>
+      <w:r>
+        <w:t xml:space="preserve">, incorporating </w:t>
+      </w:r>
+      <w:r>
+        <w:rPr>
+          <w:b/>
+        </w:rPr>
+        <w:t>hands-on projects, Kaggle challenges, and interactive coding sessions</w:t>
+      </w:r>
+      <w:r>
+        <w:t xml:space="preserve">. Provided </w:t>
+      </w:r>
+      <w:r>
+        <w:rPr>
+          <w:b/>
+        </w:rPr>
+        <w:t>mentorship and guidance</w:t>
+      </w:r>
+      <w:r>
+        <w:t xml:space="preserve"> for students pursuing careers in data analytics and ML.</w:t>
       </w:r>
     </w:p>
     <w:p>
@@ -1381,13 +2474,51 @@
         </w:numPr>
       </w:pPr>
       <w:r>
-        <w:t xml:space="preserve">Paid Internship 3 - Conducted </w:t>
-      </w:r>
-      <w:r>
-        <w:rPr>
-          <w:b/>
-        </w:rPr>
-        <w:t>data science and machine learning training</w:t>
+        <w:t xml:space="preserve">Paid internship 1 - Upskilled </w:t>
+      </w:r>
+      <w:r>
+        <w:rPr>
+          <w:b/>
+        </w:rPr>
+        <w:t>1400+ students in advanced machine learning concepts</w:t>
+      </w:r>
+      <w:r>
+        <w:t xml:space="preserve">, including </w:t>
+      </w:r>
+      <w:r>
+        <w:rPr>
+          <w:b/>
+        </w:rPr>
+        <w:t>deep learning, NLP, and AI-driven applications</w:t>
+      </w:r>
+      <w:r>
+        <w:t xml:space="preserve">. Delivered </w:t>
+      </w:r>
+      <w:r>
+        <w:rPr>
+          <w:b/>
+        </w:rPr>
+        <w:t>highly engaging offline and online training programs</w:t>
+      </w:r>
+      <w:r>
+        <w:t xml:space="preserve"> with industry use cases.</w:t>
+      </w:r>
+    </w:p>
+    <w:p>
+      <w:pPr>
+        <w:numPr>
+          <w:ilvl w:val="0"/>
+          <w:numId w:val="4"/>
+        </w:numPr>
+      </w:pPr>
+      <w:r>
+        <w:t xml:space="preserve">Unpaid Internship 1 - Conducted large-scale </w:t>
+      </w:r>
+      <w:r>
+        <w:rPr>
+          <w:b/>
+        </w:rPr>
+        <w:t>data science workshops</w:t>
       </w:r>
       <w:r>
         <w:t xml:space="preserve"> for </w:t>
@@ -1396,292 +2527,66 @@
         <w:rPr>
           <w:b/>
         </w:rPr>
-        <w:t>300+ students</w:t>
-      </w:r>
-      <w:r>
-        <w:t xml:space="preserve"> across multiple universities, covering both </w:t>
-      </w:r>
-      <w:r>
-        <w:rPr>
-          <w:b/>
-        </w:rPr>
-        <w:t>theoretical concepts and hands-on projects</w:t>
+        <w:t>5000+ students</w:t>
+      </w:r>
+      <w:r>
+        <w:t xml:space="preserve">, covering topics from </w:t>
+      </w:r>
+      <w:r>
+        <w:rPr>
+          <w:b/>
+        </w:rPr>
+        <w:t>data preprocessing to deployment of ML models</w:t>
+      </w:r>
+      <w:r>
+        <w:t xml:space="preserve">. Created </w:t>
+      </w:r>
+      <w:r>
+        <w:rPr>
+          <w:b/>
+        </w:rPr>
+        <w:t>customized learning paths</w:t>
+      </w:r>
+      <w:r>
+        <w:t xml:space="preserve"> to cater to both beginners and advanced learners.</w:t>
+      </w:r>
+    </w:p>
+    <w:p>
+      <w:pPr>
+        <w:numPr>
+          <w:ilvl w:val="0"/>
+          <w:numId w:val="4"/>
+        </w:numPr>
+      </w:pPr>
+      <w:r>
+        <w:t xml:space="preserve">Babba 2.0 - Upskilled </w:t>
+      </w:r>
+      <w:r>
+        <w:rPr>
+          <w:b/>
+        </w:rPr>
+        <w:t>100+ students</w:t>
+      </w:r>
+      <w:r>
+        <w:t xml:space="preserve"> through an </w:t>
+      </w:r>
+      <w:r>
+        <w:rPr>
+          <w:b/>
+        </w:rPr>
+        <w:t>intensive data science and machine learning program</w:t>
+      </w:r>
+      <w:r>
+        <w:t xml:space="preserve">, providing </w:t>
+      </w:r>
+      <w:r>
+        <w:rPr>
+          <w:b/>
+        </w:rPr>
+        <w:t>practical knowledge in Python, AI, and analytics</w:t>
       </w:r>
       <w:r>
         <w:t xml:space="preserve">. Delivered </w:t>
-      </w:r>
-      <w:r>
-        <w:rPr>
-          <w:b/>
-        </w:rPr>
-        <w:t>interactive offline and online sessions</w:t>
-      </w:r>
-      <w:r>
-        <w:t xml:space="preserve"> to enhance practical skills and industry readiness.</w:t>
-      </w:r>
-    </w:p>
-    <w:p>
-      <w:pPr>
-        <w:numPr>
-          <w:ilvl w:val="0"/>
-          <w:numId w:val="4"/>
-        </w:numPr>
-      </w:pPr>
-      <w:r>
-        <w:t xml:space="preserve">Unpaid Internship 3 - Led </w:t>
-      </w:r>
-      <w:r>
-        <w:rPr>
-          <w:b/>
-        </w:rPr>
-        <w:t>data science upskilling sessions</w:t>
-      </w:r>
-      <w:r>
-        <w:t xml:space="preserve"> for </w:t>
-      </w:r>
-      <w:r>
-        <w:rPr>
-          <w:b/>
-        </w:rPr>
-        <w:t>500+ students</w:t>
-      </w:r>
-      <w:r>
-        <w:t xml:space="preserve">, providing </w:t>
-      </w:r>
-      <w:r>
-        <w:rPr>
-          <w:b/>
-        </w:rPr>
-        <w:t>foundational knowledge in machine learning, data analytics, and Python programming</w:t>
-      </w:r>
-      <w:r>
-        <w:t xml:space="preserve">. Engaged students in </w:t>
-      </w:r>
-      <w:r>
-        <w:rPr>
-          <w:b/>
-        </w:rPr>
-        <w:t>real-world case studies and live coding exercises</w:t>
-      </w:r>
-      <w:r>
-        <w:t xml:space="preserve"> to reinforce learning.</w:t>
-      </w:r>
-    </w:p>
-    <w:p>
-      <w:pPr>
-        <w:numPr>
-          <w:ilvl w:val="0"/>
-          <w:numId w:val="4"/>
-        </w:numPr>
-      </w:pPr>
-      <w:r>
-        <w:t xml:space="preserve">Paid internship 2 - Designed and delivered </w:t>
-      </w:r>
-      <w:r>
-        <w:rPr>
-          <w:b/>
-        </w:rPr>
-        <w:t>structured data science training</w:t>
-      </w:r>
-      <w:r>
-        <w:t xml:space="preserve"> for </w:t>
-      </w:r>
-      <w:r>
-        <w:rPr>
-          <w:b/>
-        </w:rPr>
-        <w:t>650+ students</w:t>
-      </w:r>
-      <w:r>
-        <w:t xml:space="preserve">, focusing on </w:t>
-      </w:r>
-      <w:r>
-        <w:rPr>
-          <w:b/>
-        </w:rPr>
-        <w:t>machine learning algorithms, model evaluation, and real-world applications</w:t>
-      </w:r>
-      <w:r>
-        <w:t xml:space="preserve">. Conducted </w:t>
-      </w:r>
-      <w:r>
-        <w:rPr>
-          <w:b/>
-        </w:rPr>
-        <w:t>live Q&amp;A sessions and mentorship</w:t>
-      </w:r>
-      <w:r>
-        <w:t xml:space="preserve"> to ensure deep understanding.</w:t>
-      </w:r>
-    </w:p>
-    <w:p>
-      <w:pPr>
-        <w:numPr>
-          <w:ilvl w:val="0"/>
-          <w:numId w:val="4"/>
-        </w:numPr>
-      </w:pPr>
-      <w:r>
-        <w:t xml:space="preserve">Unpaid internship 2 - Trained </w:t>
-      </w:r>
-      <w:r>
-        <w:rPr>
-          <w:b/>
-        </w:rPr>
-        <w:t>900+ students in data science and AI fundamentals</w:t>
-      </w:r>
-      <w:r>
-        <w:t xml:space="preserve">, incorporating </w:t>
-      </w:r>
-      <w:r>
-        <w:rPr>
-          <w:b/>
-        </w:rPr>
-        <w:t>hands-on projects, Kaggle challenges, and interactive coding sessions</w:t>
-      </w:r>
-      <w:r>
-        <w:t xml:space="preserve">. Provided </w:t>
-      </w:r>
-      <w:r>
-        <w:rPr>
-          <w:b/>
-        </w:rPr>
-        <w:t>mentorship and guidance</w:t>
-      </w:r>
-      <w:r>
-        <w:t xml:space="preserve"> for students pursuing careers in data analytics and ML.</w:t>
-      </w:r>
-    </w:p>
-    <w:p>
-      <w:pPr>
-        <w:numPr>
-          <w:ilvl w:val="0"/>
-          <w:numId w:val="4"/>
-        </w:numPr>
-      </w:pPr>
-      <w:r>
-        <w:t xml:space="preserve">Paid internship 1 - Upskilled </w:t>
-      </w:r>
-      <w:r>
-        <w:rPr>
-          <w:b/>
-        </w:rPr>
-        <w:t>1400+ students in advanced machine learning concepts</w:t>
-      </w:r>
-      <w:r>
-        <w:t xml:space="preserve">, including </w:t>
-      </w:r>
-      <w:r>
-        <w:rPr>
-          <w:b/>
-        </w:rPr>
-        <w:t>deep learning, NLP, and AI-driven applications</w:t>
-      </w:r>
-      <w:r>
-        <w:t xml:space="preserve">. Delivered </w:t>
-      </w:r>
-      <w:r>
-        <w:rPr>
-          <w:b/>
-        </w:rPr>
-        <w:t>highly engaging offline and online training programs</w:t>
-      </w:r>
-      <w:r>
-        <w:t xml:space="preserve"> with industry use cases.</w:t>
-      </w:r>
-    </w:p>
-    <w:p>
-      <w:pPr>
-        <w:numPr>
-          <w:ilvl w:val="0"/>
-          <w:numId w:val="4"/>
-        </w:numPr>
-      </w:pPr>
-      <w:r>
-        <w:t xml:space="preserve">Unpaid Internship 1 - Conducted large-scale </w:t>
-      </w:r>
-      <w:r>
-        <w:rPr>
-          <w:b/>
-        </w:rPr>
-        <w:t>data science workshops</w:t>
-      </w:r>
-      <w:r>
-        <w:t xml:space="preserve"> for </w:t>
-      </w:r>
-      <w:r>
-        <w:rPr>
-          <w:b/>
-        </w:rPr>
-        <w:t>5000+ students</w:t>
-      </w:r>
-      <w:r>
-        <w:t xml:space="preserve">, covering topics from </w:t>
-      </w:r>
-      <w:r>
-        <w:rPr>
-          <w:b/>
-        </w:rPr>
-        <w:t>data preprocessing to deployment of ML models</w:t>
-      </w:r>
-      <w:r>
-        <w:t xml:space="preserve">. Created </w:t>
-      </w:r>
-      <w:r>
-        <w:rPr>
-          <w:b/>
-        </w:rPr>
-        <w:t>customized learning paths</w:t>
-      </w:r>
-      <w:r>
-        <w:t xml:space="preserve"> to cater to both beginners and advanced learners.</w:t>
-      </w:r>
-    </w:p>
-    <w:p>
-      <w:pPr>
-        <w:numPr>
-          <w:ilvl w:val="0"/>
-          <w:numId w:val="4"/>
-        </w:numPr>
-      </w:pPr>
-      <w:proofErr w:type="spellStart"/>
-      <w:r>
-        <w:t>Babba</w:t>
-      </w:r>
-      <w:proofErr w:type="spellEnd"/>
-      <w:r>
-        <w:t xml:space="preserve"> 2.0 - Upskilled </w:t>
-      </w:r>
-      <w:r>
-        <w:rPr>
-          <w:b/>
-        </w:rPr>
-        <w:t>100+ students</w:t>
-      </w:r>
-      <w:r>
-        <w:t xml:space="preserve"> through an </w:t>
-      </w:r>
-      <w:r>
-        <w:rPr>
-          <w:b/>
-        </w:rPr>
-        <w:t>intensive data science and machine learning program</w:t>
-      </w:r>
-      <w:r>
-        <w:t xml:space="preserve">, providing </w:t>
-      </w:r>
-      <w:r>
-        <w:rPr>
-          <w:b/>
-        </w:rPr>
-        <w:t>practical knowledge in Python, AI, and analytics</w:t>
-      </w:r>
-      <w:r>
-        <w:t xml:space="preserve">. </w:t>
-      </w:r>
-      <w:r>
-        <w:lastRenderedPageBreak/>
-        <w:t xml:space="preserve">Delivered </w:t>
       </w:r>
       <w:r>
         <w:rPr>
@@ -2074,6 +2979,7 @@
     </w:p>
     <w:p>
       <w:r>
+        <w:lastRenderedPageBreak/>
         <w:t>PG Certification - Machine learning and Deep learning</w:t>
       </w:r>
     </w:p>
@@ -2281,7 +3187,6 @@
         <w:rPr>
           <w:b/>
         </w:rPr>
-        <w:lastRenderedPageBreak/>
         <w:t>Focused on Machine Learning and Deep Learning</w:t>
       </w:r>
       <w:r>
@@ -2615,6 +3520,7 @@
         </w:numPr>
       </w:pPr>
       <w:r>
+        <w:lastRenderedPageBreak/>
         <w:t xml:space="preserve">Gained hands-on experience in </w:t>
       </w:r>
       <w:r>
@@ -2812,7 +3718,6 @@
         <w:rPr>
           <w:b/>
         </w:rPr>
-        <w:lastRenderedPageBreak/>
         <w:t>Machine Learning - Dimensionality Reduction</w:t>
       </w:r>
       <w:r>
@@ -3456,83 +4361,83 @@
       </w:r>
       <w:proofErr w:type="spellEnd"/>
       <w:r>
-        <w:t xml:space="preserve">/Mistral/Falcon Models, </w:t>
+        <w:t xml:space="preserve">/Mistral/Falcon Models, T5 &amp; BART, Hugging Face Transformers, Diffusion Models (Stable Diffusion, DALL·E), Vision-Language Models (CLIP, BLIP), Text-to-Image &amp; Text-to-Video Generation, Multi-Modal AI (Image, Audio, Text), </w:t>
+      </w:r>
+      <w:proofErr w:type="spellStart"/>
+      <w:r>
+        <w:t>LangChain</w:t>
+      </w:r>
+      <w:proofErr w:type="spellEnd"/>
+      <w:r>
+        <w:t xml:space="preserve"> &amp; </w:t>
+      </w:r>
+      <w:proofErr w:type="spellStart"/>
+      <w:r>
+        <w:t>LlamaIndex</w:t>
+      </w:r>
+      <w:proofErr w:type="spellEnd"/>
+      <w:r>
+        <w:t xml:space="preserve">, Knowledge Graphs for LLMs, Few-shot &amp; Zero-shot Learning, AI Agents &amp; Function Calling, Reinforcement Learning with Human Feedback (RLHF), Model Quantization &amp; Distillation, Fine-Tuning Open-Source LLMs, Machine Learning Fundamentals, Deep Learning Architectures, Predictive Modeling, Regression (Linear, Logistic), Classification Algorithms, Clustering (K-Means, DBSCAN), Decision Trees &amp; Random Forest, Support Vector Machines (SVM), Ensemble Learning (Bagging &amp; Boosting), </w:t>
+      </w:r>
+      <w:proofErr w:type="spellStart"/>
+      <w:r>
+        <w:t>XGBoost</w:t>
+      </w:r>
+      <w:proofErr w:type="spellEnd"/>
+      <w:r>
+        <w:t xml:space="preserve"> &amp; </w:t>
+      </w:r>
+      <w:proofErr w:type="spellStart"/>
+      <w:r>
+        <w:t>LightGBM</w:t>
+      </w:r>
+      <w:proofErr w:type="spellEnd"/>
+      <w:r>
+        <w:t>, Neural Networks (ANN, CNN, RNN, LSTM, GRU), Autoencoders &amp; GANs, Transfer Learning, Optimization Algorithms (Adam, RMSprop, SGD), Bayesian Optimization, Bayesian Networks &amp; Probabilistic Graphical Models, Model Explainability (SHAP, LIME), Adversarial Machine Learning, Hyperparameter Tuning (</w:t>
+      </w:r>
+      <w:proofErr w:type="spellStart"/>
+      <w:r>
+        <w:t>Optuna</w:t>
+      </w:r>
+      <w:proofErr w:type="spellEnd"/>
+      <w:r>
+        <w:t xml:space="preserve">, Grid/Random Search), Anomaly Detection, Named Entity Recognition (NER), Text Classification &amp; Sentiment Analysis, Machine Translation &amp; Speech Recognition, Document Understanding &amp; Summarization, Optical Character Recognition (OCR), Image Captioning, Object Detection &amp; Image Segmentation, Speech-to-Text &amp; Text-to-Speech (Whisper, Coqui), Face Recognition &amp; Pose Estimation, Scene Understanding &amp; Video Analytics, REST API &amp; </w:t>
+      </w:r>
+      <w:proofErr w:type="spellStart"/>
+      <w:r>
+        <w:t>FastAPI</w:t>
+      </w:r>
+      <w:proofErr w:type="spellEnd"/>
+      <w:r>
+        <w:t xml:space="preserve"> Development, </w:t>
+      </w:r>
+      <w:proofErr w:type="spellStart"/>
+      <w:r>
+        <w:t>GraphQL</w:t>
+      </w:r>
+      <w:proofErr w:type="spellEnd"/>
+      <w:r>
+        <w:t xml:space="preserve"> for AI Applications, Docker &amp; Kubernetes (K8s) for AI Deployment, CI/CD for ML Models, Model Serving (Triton, TensorFlow Serving), API Gateway &amp; Load Balancing, Model Monitoring &amp; Observability, Vector Databases (Pinecone, Chroma, FAISS), Feature Engineering &amp; Data Pipelines, Serverless AI (AWS Lambda, GCP Cloud Functions), AWS </w:t>
+      </w:r>
+      <w:proofErr w:type="spellStart"/>
+      <w:r>
+        <w:t>SageMaker</w:t>
+      </w:r>
+      <w:proofErr w:type="spellEnd"/>
+      <w:r>
+        <w:t xml:space="preserve"> &amp; Azure ML, Google Vertex AI, Distributed Computing (Spark, Ray), Big Data Processing (Hadoop, </w:t>
+      </w:r>
+      <w:proofErr w:type="spellStart"/>
+      <w:r>
+        <w:t>Dask</w:t>
+      </w:r>
+      <w:proofErr w:type="spellEnd"/>
+      <w:r>
+        <w:t xml:space="preserve">), Cloud Storage for AI Models (S3, GCS, Azure Blob), Stream Processing (Kafka, Flink), AI Governance &amp; Compliance, Secure AI Workloads (IAM, KMS, RBAC), Cost Optimization for AI Workloads, Edge AI &amp; On-Device Inference, AI/ML Product Strategy, Technical Roadmap Planning, Cross-functional Team Leadership, Agile &amp; Scrum for AI Projects, Stakeholder Communication, AI Ethics &amp; Responsible AI Development, Business Intelligence &amp; Data-Driven </w:t>
       </w:r>
       <w:r>
         <w:lastRenderedPageBreak/>
-        <w:t xml:space="preserve">T5 &amp; BART, Hugging Face Transformers, Diffusion Models (Stable Diffusion, DALL·E), Vision-Language Models (CLIP, BLIP), Text-to-Image &amp; Text-to-Video Generation, Multi-Modal AI (Image, Audio, Text), </w:t>
-      </w:r>
-      <w:proofErr w:type="spellStart"/>
-      <w:r>
-        <w:t>LangChain</w:t>
-      </w:r>
-      <w:proofErr w:type="spellEnd"/>
-      <w:r>
-        <w:t xml:space="preserve"> &amp; </w:t>
-      </w:r>
-      <w:proofErr w:type="spellStart"/>
-      <w:r>
-        <w:t>LlamaIndex</w:t>
-      </w:r>
-      <w:proofErr w:type="spellEnd"/>
-      <w:r>
-        <w:t xml:space="preserve">, Knowledge Graphs for LLMs, Few-shot &amp; Zero-shot Learning, AI Agents &amp; Function Calling, Reinforcement Learning with Human Feedback (RLHF), Model Quantization &amp; Distillation, Fine-Tuning Open-Source LLMs, Machine Learning Fundamentals, Deep Learning Architectures, Predictive Modeling, Regression (Linear, Logistic), Classification Algorithms, Clustering (K-Means, DBSCAN), Decision Trees &amp; Random Forest, Support Vector Machines (SVM), Ensemble Learning (Bagging &amp; Boosting), </w:t>
-      </w:r>
-      <w:proofErr w:type="spellStart"/>
-      <w:r>
-        <w:t>XGBoost</w:t>
-      </w:r>
-      <w:proofErr w:type="spellEnd"/>
-      <w:r>
-        <w:t xml:space="preserve"> &amp; </w:t>
-      </w:r>
-      <w:proofErr w:type="spellStart"/>
-      <w:r>
-        <w:t>LightGBM</w:t>
-      </w:r>
-      <w:proofErr w:type="spellEnd"/>
-      <w:r>
-        <w:t>, Neural Networks (ANN, CNN, RNN, LSTM, GRU), Autoencoders &amp; GANs, Transfer Learning, Optimization Algorithms (Adam, RMSprop, SGD), Bayesian Optimization, Bayesian Networks &amp; Probabilistic Graphical Models, Model Explainability (SHAP, LIME), Adversarial Machine Learning, Hyperparameter Tuning (</w:t>
-      </w:r>
-      <w:proofErr w:type="spellStart"/>
-      <w:r>
-        <w:t>Optuna</w:t>
-      </w:r>
-      <w:proofErr w:type="spellEnd"/>
-      <w:r>
-        <w:t xml:space="preserve">, Grid/Random Search), Anomaly Detection, Named Entity Recognition (NER), Text Classification &amp; Sentiment Analysis, Machine Translation &amp; Speech Recognition, Document Understanding &amp; Summarization, Optical Character Recognition (OCR), Image Captioning, Object Detection &amp; Image Segmentation, Speech-to-Text &amp; Text-to-Speech (Whisper, Coqui), Face Recognition &amp; Pose Estimation, Scene Understanding &amp; Video Analytics, REST API &amp; </w:t>
-      </w:r>
-      <w:proofErr w:type="spellStart"/>
-      <w:r>
-        <w:t>FastAPI</w:t>
-      </w:r>
-      <w:proofErr w:type="spellEnd"/>
-      <w:r>
-        <w:t xml:space="preserve"> Development, </w:t>
-      </w:r>
-      <w:proofErr w:type="spellStart"/>
-      <w:r>
-        <w:t>GraphQL</w:t>
-      </w:r>
-      <w:proofErr w:type="spellEnd"/>
-      <w:r>
-        <w:t xml:space="preserve"> for AI Applications, Docker &amp; Kubernetes (K8s) for AI Deployment, CI/CD for ML Models, Model Serving (Triton, TensorFlow Serving), API Gateway &amp; Load Balancing, Model Monitoring &amp; Observability, Vector Databases (Pinecone, Chroma, FAISS), Feature Engineering &amp; Data Pipelines, Serverless AI (AWS Lambda, GCP Cloud Functions), AWS </w:t>
-      </w:r>
-      <w:proofErr w:type="spellStart"/>
-      <w:r>
-        <w:t>SageMaker</w:t>
-      </w:r>
-      <w:proofErr w:type="spellEnd"/>
-      <w:r>
-        <w:t xml:space="preserve"> &amp; Azure ML, Google Vertex AI, Distributed Computing (Spark, Ray), Big Data Processing (Hadoop, </w:t>
-      </w:r>
-      <w:proofErr w:type="spellStart"/>
-      <w:r>
-        <w:t>Dask</w:t>
-      </w:r>
-      <w:proofErr w:type="spellEnd"/>
-      <w:r>
-        <w:t>), Cloud Storage for AI Models (S3, GCS, Azure Blob), Stream Processing (Kafka, Flink), AI Governance &amp; Compliance, Secure AI Workloads (IAM, KMS, RBAC), Cost Optimization for AI Workloads, Edge AI &amp; On-Device Inference, AI/ML Product Strategy, Technical Roadmap Planning, Cross-functional Team Leadership, Agile &amp; Scrum for AI Projects, Stakeholder Communication, AI Ethics &amp; Responsible AI Development, Business Intelligence &amp; Data-Driven Decision Making, Budgeting &amp; Cost Optimization in AI Projects, Hiring &amp; Scaling AI Teams, Client Engagement &amp; Pre-Sales AI Consulting, Large-Scale Model Training &amp; Optimization, AI for Edge &amp; IoT Devices, Bioinformatics &amp; AI in Healthcare, AI in Financial Technology (FinTech), AI in Supply Chain Optimization, AI in Smart Cities &amp; Urban Planning, Synthetic Data Generation, AI-Augmented Creativity (Music, Art, Code), Self-Supervised Learning, Federated Learning &amp; Privacy-Preserving AI, Problem-Solving &amp; Analytical Thinking, Communication &amp; Presentation Skills, Mentoring &amp; Team Development, Negotiation &amp; Conflict Resolution, Time Management &amp; Productivity Optimization, Adaptability &amp; Continuous Learning, Ethical AI Decision Making, Entrepreneurship &amp; AI Startups, Technical Writing &amp; AI Blogging, Public Speaking on AI &amp; Data Science</w:t>
+        <w:t>Decision Making, Budgeting &amp; Cost Optimization in AI Projects, Hiring &amp; Scaling AI Teams, Client Engagement &amp; Pre-Sales AI Consulting, Large-Scale Model Training &amp; Optimization, AI for Edge &amp; IoT Devices, Bioinformatics &amp; AI in Healthcare, AI in Financial Technology (FinTech), AI in Supply Chain Optimization, AI in Smart Cities &amp; Urban Planning, Synthetic Data Generation, AI-Augmented Creativity (Music, Art, Code), Self-Supervised Learning, Federated Learning &amp; Privacy-Preserving AI, Problem-Solving &amp; Analytical Thinking, Communication &amp; Presentation Skills, Mentoring &amp; Team Development, Negotiation &amp; Conflict Resolution, Time Management &amp; Productivity Optimization, Adaptability &amp; Continuous Learning, Ethical AI Decision Making, Entrepreneurship &amp; AI Startups, Technical Writing &amp; AI Blogging, Public Speaking on AI &amp; Data Science</w:t>
       </w:r>
     </w:p>
     <w:p/>
@@ -3614,7 +4519,6 @@
         <w:rPr>
           <w:b/>
         </w:rPr>
-        <w:lastRenderedPageBreak/>
         <w:t xml:space="preserve">Language - </w:t>
       </w:r>
     </w:p>
@@ -4622,6 +5526,95 @@
     </w:lvl>
   </w:abstractNum>
   <w:abstractNum w:abstractNumId="8" w15:restartNumberingAfterBreak="0">
+    <w:nsid w:val="45B628B2"/>
+    <w:multiLevelType w:val="hybridMultilevel"/>
+    <w:tmpl w:val="4F026290"/>
+    <w:lvl w:ilvl="0" w:tplc="0809000F">
+      <w:start w:val="1"/>
+      <w:numFmt w:val="decimal"/>
+      <w:lvlText w:val="%1."/>
+      <w:lvlJc w:val="left"/>
+      <w:pPr>
+        <w:ind w:left="720" w:hanging="360"/>
+      </w:pPr>
+      <w:rPr>
+        <w:rFonts w:hint="default"/>
+      </w:rPr>
+    </w:lvl>
+    <w:lvl w:ilvl="1" w:tplc="08090019" w:tentative="1">
+      <w:start w:val="1"/>
+      <w:numFmt w:val="lowerLetter"/>
+      <w:lvlText w:val="%2."/>
+      <w:lvlJc w:val="left"/>
+      <w:pPr>
+        <w:ind w:left="1440" w:hanging="360"/>
+      </w:pPr>
+    </w:lvl>
+    <w:lvl w:ilvl="2" w:tplc="0809001B" w:tentative="1">
+      <w:start w:val="1"/>
+      <w:numFmt w:val="lowerRoman"/>
+      <w:lvlText w:val="%3."/>
+      <w:lvlJc w:val="right"/>
+      <w:pPr>
+        <w:ind w:left="2160" w:hanging="180"/>
+      </w:pPr>
+    </w:lvl>
+    <w:lvl w:ilvl="3" w:tplc="0809000F" w:tentative="1">
+      <w:start w:val="1"/>
+      <w:numFmt w:val="decimal"/>
+      <w:lvlText w:val="%4."/>
+      <w:lvlJc w:val="left"/>
+      <w:pPr>
+        <w:ind w:left="2880" w:hanging="360"/>
+      </w:pPr>
+    </w:lvl>
+    <w:lvl w:ilvl="4" w:tplc="08090019" w:tentative="1">
+      <w:start w:val="1"/>
+      <w:numFmt w:val="lowerLetter"/>
+      <w:lvlText w:val="%5."/>
+      <w:lvlJc w:val="left"/>
+      <w:pPr>
+        <w:ind w:left="3600" w:hanging="360"/>
+      </w:pPr>
+    </w:lvl>
+    <w:lvl w:ilvl="5" w:tplc="0809001B" w:tentative="1">
+      <w:start w:val="1"/>
+      <w:numFmt w:val="lowerRoman"/>
+      <w:lvlText w:val="%6."/>
+      <w:lvlJc w:val="right"/>
+      <w:pPr>
+        <w:ind w:left="4320" w:hanging="180"/>
+      </w:pPr>
+    </w:lvl>
+    <w:lvl w:ilvl="6" w:tplc="0809000F" w:tentative="1">
+      <w:start w:val="1"/>
+      <w:numFmt w:val="decimal"/>
+      <w:lvlText w:val="%7."/>
+      <w:lvlJc w:val="left"/>
+      <w:pPr>
+        <w:ind w:left="5040" w:hanging="360"/>
+      </w:pPr>
+    </w:lvl>
+    <w:lvl w:ilvl="7" w:tplc="08090019" w:tentative="1">
+      <w:start w:val="1"/>
+      <w:numFmt w:val="lowerLetter"/>
+      <w:lvlText w:val="%8."/>
+      <w:lvlJc w:val="left"/>
+      <w:pPr>
+        <w:ind w:left="5760" w:hanging="360"/>
+      </w:pPr>
+    </w:lvl>
+    <w:lvl w:ilvl="8" w:tplc="0809001B" w:tentative="1">
+      <w:start w:val="1"/>
+      <w:numFmt w:val="lowerRoman"/>
+      <w:lvlText w:val="%9."/>
+      <w:lvlJc w:val="right"/>
+      <w:pPr>
+        <w:ind w:left="6480" w:hanging="180"/>
+      </w:pPr>
+    </w:lvl>
+  </w:abstractNum>
+  <w:abstractNum w:abstractNumId="9" w15:restartNumberingAfterBreak="0">
     <w:nsid w:val="56D62246"/>
     <w:multiLevelType w:val="multilevel"/>
     <w:tmpl w:val="0D32B204"/>
@@ -4734,7 +5727,7 @@
       </w:rPr>
     </w:lvl>
   </w:abstractNum>
-  <w:abstractNum w:abstractNumId="9" w15:restartNumberingAfterBreak="0">
+  <w:abstractNum w:abstractNumId="10" w15:restartNumberingAfterBreak="0">
     <w:nsid w:val="622F633E"/>
     <w:multiLevelType w:val="multilevel"/>
     <w:tmpl w:val="FB9AD2CC"/>
@@ -4847,7 +5840,7 @@
       </w:rPr>
     </w:lvl>
   </w:abstractNum>
-  <w:abstractNum w:abstractNumId="10" w15:restartNumberingAfterBreak="0">
+  <w:abstractNum w:abstractNumId="11" w15:restartNumberingAfterBreak="0">
     <w:nsid w:val="79A74551"/>
     <w:multiLevelType w:val="multilevel"/>
     <w:tmpl w:val="E76A6A04"/>
@@ -4961,7 +5954,7 @@
     </w:lvl>
   </w:abstractNum>
   <w:num w:numId="1" w16cid:durableId="623729956">
-    <w:abstractNumId w:val="9"/>
+    <w:abstractNumId w:val="10"/>
   </w:num>
   <w:num w:numId="2" w16cid:durableId="1997606423">
     <w:abstractNumId w:val="7"/>
@@ -4976,7 +5969,7 @@
     <w:abstractNumId w:val="4"/>
   </w:num>
   <w:num w:numId="6" w16cid:durableId="1322931800">
-    <w:abstractNumId w:val="8"/>
+    <w:abstractNumId w:val="9"/>
   </w:num>
   <w:num w:numId="7" w16cid:durableId="121308769">
     <w:abstractNumId w:val="6"/>
@@ -4988,10 +5981,13 @@
     <w:abstractNumId w:val="2"/>
   </w:num>
   <w:num w:numId="10" w16cid:durableId="814224372">
-    <w:abstractNumId w:val="10"/>
+    <w:abstractNumId w:val="11"/>
   </w:num>
   <w:num w:numId="11" w16cid:durableId="1316643842">
     <w:abstractNumId w:val="5"/>
+  </w:num>
+  <w:num w:numId="12" w16cid:durableId="675577428">
+    <w:abstractNumId w:val="8"/>
   </w:num>
 </w:numbering>
 </file>
@@ -5568,6 +6564,102 @@
       <w:szCs w:val="30"/>
     </w:rPr>
   </w:style>
+  <w:style w:type="paragraph" w:styleId="ListParagraph">
+    <w:name w:val="List Paragraph"/>
+    <w:basedOn w:val="Normal"/>
+    <w:uiPriority w:val="34"/>
+    <w:qFormat/>
+    <w:rsid w:val="001E1442"/>
+    <w:pPr>
+      <w:ind w:left="720"/>
+      <w:contextualSpacing/>
+    </w:pPr>
+  </w:style>
+  <w:style w:type="paragraph" w:customStyle="1" w:styleId="p1">
+    <w:name w:val="p1"/>
+    <w:basedOn w:val="Normal"/>
+    <w:rsid w:val="001E1442"/>
+    <w:pPr>
+      <w:spacing w:before="100" w:beforeAutospacing="1" w:after="100" w:afterAutospacing="1" w:line="240" w:lineRule="auto"/>
+    </w:pPr>
+    <w:rPr>
+      <w:rFonts w:ascii="Times New Roman" w:eastAsia="Times New Roman" w:hAnsi="Times New Roman" w:cs="Times New Roman"/>
+      <w:sz w:val="24"/>
+      <w:szCs w:val="24"/>
+      <w:lang w:val="en-IN"/>
+    </w:rPr>
+  </w:style>
+  <w:style w:type="character" w:customStyle="1" w:styleId="s1">
+    <w:name w:val="s1"/>
+    <w:basedOn w:val="DefaultParagraphFont"/>
+    <w:rsid w:val="001E1442"/>
+  </w:style>
+  <w:style w:type="paragraph" w:customStyle="1" w:styleId="p2">
+    <w:name w:val="p2"/>
+    <w:basedOn w:val="Normal"/>
+    <w:rsid w:val="009875E0"/>
+    <w:pPr>
+      <w:spacing w:before="100" w:beforeAutospacing="1" w:after="100" w:afterAutospacing="1" w:line="240" w:lineRule="auto"/>
+    </w:pPr>
+    <w:rPr>
+      <w:rFonts w:ascii="Times New Roman" w:eastAsia="Times New Roman" w:hAnsi="Times New Roman" w:cs="Times New Roman"/>
+      <w:sz w:val="24"/>
+      <w:szCs w:val="24"/>
+      <w:lang w:val="en-IN"/>
+    </w:rPr>
+  </w:style>
+  <w:style w:type="paragraph" w:customStyle="1" w:styleId="p3">
+    <w:name w:val="p3"/>
+    <w:basedOn w:val="Normal"/>
+    <w:rsid w:val="009875E0"/>
+    <w:pPr>
+      <w:spacing w:before="100" w:beforeAutospacing="1" w:after="100" w:afterAutospacing="1" w:line="240" w:lineRule="auto"/>
+    </w:pPr>
+    <w:rPr>
+      <w:rFonts w:ascii="Times New Roman" w:eastAsia="Times New Roman" w:hAnsi="Times New Roman" w:cs="Times New Roman"/>
+      <w:sz w:val="24"/>
+      <w:szCs w:val="24"/>
+      <w:lang w:val="en-IN"/>
+    </w:rPr>
+  </w:style>
+  <w:style w:type="paragraph" w:customStyle="1" w:styleId="p4">
+    <w:name w:val="p4"/>
+    <w:basedOn w:val="Normal"/>
+    <w:rsid w:val="009875E0"/>
+    <w:pPr>
+      <w:spacing w:before="100" w:beforeAutospacing="1" w:after="100" w:afterAutospacing="1" w:line="240" w:lineRule="auto"/>
+    </w:pPr>
+    <w:rPr>
+      <w:rFonts w:ascii="Times New Roman" w:eastAsia="Times New Roman" w:hAnsi="Times New Roman" w:cs="Times New Roman"/>
+      <w:sz w:val="24"/>
+      <w:szCs w:val="24"/>
+      <w:lang w:val="en-IN"/>
+    </w:rPr>
+  </w:style>
+  <w:style w:type="character" w:customStyle="1" w:styleId="apple-tab-span">
+    <w:name w:val="apple-tab-span"/>
+    <w:basedOn w:val="DefaultParagraphFont"/>
+    <w:rsid w:val="009875E0"/>
+  </w:style>
+  <w:style w:type="paragraph" w:customStyle="1" w:styleId="p5">
+    <w:name w:val="p5"/>
+    <w:basedOn w:val="Normal"/>
+    <w:rsid w:val="009875E0"/>
+    <w:pPr>
+      <w:spacing w:before="100" w:beforeAutospacing="1" w:after="100" w:afterAutospacing="1" w:line="240" w:lineRule="auto"/>
+    </w:pPr>
+    <w:rPr>
+      <w:rFonts w:ascii="Times New Roman" w:eastAsia="Times New Roman" w:hAnsi="Times New Roman" w:cs="Times New Roman"/>
+      <w:sz w:val="24"/>
+      <w:szCs w:val="24"/>
+      <w:lang w:val="en-IN"/>
+    </w:rPr>
+  </w:style>
+  <w:style w:type="character" w:customStyle="1" w:styleId="s2">
+    <w:name w:val="s2"/>
+    <w:basedOn w:val="DefaultParagraphFont"/>
+    <w:rsid w:val="009875E0"/>
+  </w:style>
 </w:styles>
 </file>
 

</xml_diff>

<commit_message>
backend Changes and Doc Update
</commit_message>
<xml_diff>
--- a/Document.docx
+++ b/Document.docx
@@ -2611,7 +2611,24 @@
       </w:r>
       <w:proofErr w:type="spellEnd"/>
       <w:r>
-        <w:t xml:space="preserve"> - Data Science </w:t>
+        <w:t xml:space="preserve"> </w:t>
+      </w:r>
+      <w:r>
+        <w:t>–</w:t>
+      </w:r>
+      <w:r>
+        <w:t xml:space="preserve"> </w:t>
+      </w:r>
+      <w:proofErr w:type="gramStart"/>
+      <w:r>
+        <w:t>Master in Technology</w:t>
+      </w:r>
+      <w:proofErr w:type="gramEnd"/>
+      <w:r>
+        <w:t xml:space="preserve"> - </w:t>
+      </w:r>
+      <w:r>
+        <w:t xml:space="preserve">Data Science </w:t>
       </w:r>
       <w:r>
         <w:t>– (Highest Qualification)</w:t>
@@ -3152,7 +3169,24 @@
       <w:proofErr w:type="spellEnd"/>
       <w:proofErr w:type="gramEnd"/>
       <w:r>
-        <w:t xml:space="preserve"> - Computer Science and Engineering</w:t>
+        <w:t xml:space="preserve"> </w:t>
+      </w:r>
+      <w:r>
+        <w:t xml:space="preserve">– </w:t>
+      </w:r>
+      <w:proofErr w:type="gramStart"/>
+      <w:r>
+        <w:t>Bachelor in Technology</w:t>
+      </w:r>
+      <w:proofErr w:type="gramEnd"/>
+      <w:r>
+        <w:t xml:space="preserve"> </w:t>
+      </w:r>
+      <w:r>
+        <w:t xml:space="preserve">- </w:t>
+      </w:r>
+      <w:r>
+        <w:t>Computer Science and Engineering</w:t>
       </w:r>
     </w:p>
     <w:p>
@@ -4606,7 +4640,355 @@
       </w:r>
       <w:proofErr w:type="spellEnd"/>
       <w:r>
-        <w:t xml:space="preserve"> - https://topmate.io/chandramouli_das</w:t>
+        <w:t xml:space="preserve"> - </w:t>
+      </w:r>
+      <w:hyperlink r:id="rId21" w:history="1">
+        <w:r>
+          <w:rPr>
+            <w:rStyle w:val="Hyperlink"/>
+          </w:rPr>
+          <w:t>https://topmate.io/chandramouli_das</w:t>
+        </w:r>
+      </w:hyperlink>
+    </w:p>
+    <w:p/>
+    <w:p/>
+    <w:p>
+      <w:r>
+        <w:t>⸻</w:t>
+      </w:r>
+    </w:p>
+    <w:p/>
+    <w:p>
+      <w:r>
+        <w:rPr>
+          <w:rFonts w:ascii="Apple Color Emoji" w:hAnsi="Apple Color Emoji" w:cs="Apple Color Emoji"/>
+        </w:rPr>
+        <w:t>🧍</w:t>
+      </w:r>
+      <w:r>
+        <w:t>‍♂️ Personal Interests &amp; Fun Facts</w:t>
+      </w:r>
+    </w:p>
+    <w:p/>
+    <w:p>
+      <w:r>
+        <w:t>Hobbies &amp; Free Time Activities</w:t>
+      </w:r>
+    </w:p>
+    <w:p>
+      <w:r>
+        <w:tab/>
+        <w:t>•Loves long motorbike rides and adventure travel—especially exploring Himalayan routes.</w:t>
+      </w:r>
+    </w:p>
+    <w:p>
+      <w:r>
+        <w:tab/>
+        <w:t>•Avid gamer with a special interest in PlayStation 5 games like Ghost of Tsushima and FIFA.</w:t>
+      </w:r>
+    </w:p>
+    <w:p>
+      <w:r>
+        <w:tab/>
+        <w:t>•Enjoys moto-vlogging and is planning an All-India bike trip with daily 15-minute travel content.</w:t>
+      </w:r>
+    </w:p>
+    <w:p>
+      <w:r>
+        <w:tab/>
+        <w:t>•Passionate about cinematic storytelling using AI tools like Ghibli-style animation.</w:t>
+      </w:r>
+    </w:p>
+    <w:p/>
+    <w:p>
+      <w:r>
+        <w:t>Favorite Foods</w:t>
+      </w:r>
+    </w:p>
+    <w:p>
+      <w:pPr>
+        <w:pStyle w:val="ListParagraph"/>
+        <w:numPr>
+          <w:ilvl w:val="0"/>
+          <w:numId w:val="13"/>
+        </w:numPr>
+      </w:pPr>
+      <w:r>
+        <w:t xml:space="preserve">Can’t resist Kolkata-style biryani with aloo </w:t>
+      </w:r>
+      <w:r>
+        <w:rPr>
+          <w:rFonts w:ascii="Apple Color Emoji" w:hAnsi="Apple Color Emoji" w:cs="Apple Color Emoji"/>
+        </w:rPr>
+        <w:t>🥔</w:t>
+      </w:r>
+      <w:r>
+        <w:t>.</w:t>
+      </w:r>
+    </w:p>
+    <w:p>
+      <w:pPr>
+        <w:pStyle w:val="ListParagraph"/>
+        <w:numPr>
+          <w:ilvl w:val="0"/>
+          <w:numId w:val="13"/>
+        </w:numPr>
+      </w:pPr>
+      <w:proofErr w:type="spellStart"/>
+      <w:r>
+        <w:lastRenderedPageBreak/>
+        <w:t>Phuchka</w:t>
+      </w:r>
+      <w:proofErr w:type="spellEnd"/>
+      <w:r>
+        <w:t xml:space="preserve">, </w:t>
+      </w:r>
+      <w:proofErr w:type="spellStart"/>
+      <w:r>
+        <w:t>Rosogolla</w:t>
+      </w:r>
+      <w:proofErr w:type="spellEnd"/>
+      <w:r>
+        <w:t xml:space="preserve"> </w:t>
+      </w:r>
+    </w:p>
+    <w:p>
+      <w:pPr>
+        <w:pStyle w:val="ListParagraph"/>
+        <w:numPr>
+          <w:ilvl w:val="0"/>
+          <w:numId w:val="13"/>
+        </w:numPr>
+      </w:pPr>
+      <w:r>
+        <w:t xml:space="preserve">Huge fan of roadside </w:t>
+      </w:r>
+      <w:proofErr w:type="spellStart"/>
+      <w:r>
+        <w:t>momos</w:t>
+      </w:r>
+      <w:proofErr w:type="spellEnd"/>
+      <w:r>
+        <w:t xml:space="preserve"> and spicy Maggi on hill stations.</w:t>
+      </w:r>
+    </w:p>
+    <w:p>
+      <w:pPr>
+        <w:pStyle w:val="ListParagraph"/>
+        <w:numPr>
+          <w:ilvl w:val="0"/>
+          <w:numId w:val="13"/>
+        </w:numPr>
+      </w:pPr>
+      <w:r>
+        <w:t xml:space="preserve">Weekend cravings: Chilli chicken and </w:t>
+      </w:r>
+      <w:proofErr w:type="spellStart"/>
+      <w:r>
+        <w:t>schezwan</w:t>
+      </w:r>
+      <w:proofErr w:type="spellEnd"/>
+      <w:r>
+        <w:t xml:space="preserve"> fried rice from local joints.</w:t>
+      </w:r>
+    </w:p>
+    <w:p/>
+    <w:p>
+      <w:r>
+        <w:t>Favorite Places</w:t>
+      </w:r>
+    </w:p>
+    <w:p>
+      <w:r>
+        <w:tab/>
+        <w:t>•</w:t>
+      </w:r>
+      <w:r>
+        <w:tab/>
+        <w:t>Ladakh, especially Pangong Lake, for serenity and motorbike thrill.</w:t>
+      </w:r>
+    </w:p>
+    <w:p>
+      <w:r>
+        <w:tab/>
+        <w:t>•</w:t>
+      </w:r>
+      <w:r>
+        <w:tab/>
+        <w:t>Rajasthan for the cultural richness and desert rides.</w:t>
+      </w:r>
+    </w:p>
+    <w:p>
+      <w:r>
+        <w:tab/>
+        <w:t>•</w:t>
+      </w:r>
+      <w:r>
+        <w:tab/>
+        <w:t>Loves the coastlines of Goa and the cafes in Pondicherry.</w:t>
+      </w:r>
+    </w:p>
+    <w:p/>
+    <w:p>
+      <w:proofErr w:type="gramStart"/>
+      <w:r>
+        <w:t>Dream</w:t>
+      </w:r>
+      <w:proofErr w:type="gramEnd"/>
+      <w:r>
+        <w:t xml:space="preserve"> Travel Plan</w:t>
+      </w:r>
+    </w:p>
+    <w:p>
+      <w:r>
+        <w:tab/>
+        <w:t>•</w:t>
+      </w:r>
+      <w:r>
+        <w:tab/>
+        <w:t>All-India solo bike tour covering 28 states.</w:t>
+      </w:r>
+    </w:p>
+    <w:p>
+      <w:r>
+        <w:tab/>
+        <w:t>•</w:t>
+      </w:r>
+      <w:r>
+        <w:tab/>
+        <w:t>Return via a different route to explore hidden gems.</w:t>
+      </w:r>
+    </w:p>
+    <w:p/>
+    <w:p>
+      <w:r>
+        <w:t>Funny Personality Traits</w:t>
+      </w:r>
+    </w:p>
+    <w:p>
+      <w:r>
+        <w:tab/>
+        <w:t>•</w:t>
+      </w:r>
+      <w:r>
+        <w:tab/>
+        <w:t>Thinks debugging a Python script is a modern-day spiritual awakening.</w:t>
+      </w:r>
+    </w:p>
+    <w:p>
+      <w:r>
+        <w:tab/>
+        <w:t>•</w:t>
+      </w:r>
+      <w:r>
+        <w:tab/>
+        <w:t>Believes “Git pull conflicts” are just Monday’s way of saying hello.</w:t>
+      </w:r>
+    </w:p>
+    <w:p>
+      <w:r>
+        <w:tab/>
+        <w:t>•</w:t>
+      </w:r>
+      <w:r>
+        <w:tab/>
+        <w:t>Has a superpower: explaining AI models to relatives who still think WhatsApp forwards are news.</w:t>
+      </w:r>
+    </w:p>
+    <w:p/>
+    <w:p>
+      <w:r>
+        <w:t>Random Facts</w:t>
+      </w:r>
+    </w:p>
+    <w:p>
+      <w:r>
+        <w:tab/>
+        <w:t>•</w:t>
+      </w:r>
+      <w:r>
+        <w:tab/>
+        <w:t>Once rode 800 km in a single stretch because Google Maps looked too optimistic.</w:t>
+      </w:r>
+    </w:p>
+    <w:p>
+      <w:r>
+        <w:tab/>
+        <w:t>•</w:t>
+      </w:r>
+      <w:r>
+        <w:tab/>
+        <w:t>Can fall asleep listening to lo-fi beats or tech podcasts.</w:t>
+      </w:r>
+    </w:p>
+    <w:p>
+      <w:r>
+        <w:tab/>
+        <w:t>•</w:t>
+      </w:r>
+      <w:r>
+        <w:tab/>
+        <w:t xml:space="preserve">Uses </w:t>
+      </w:r>
+      <w:proofErr w:type="spellStart"/>
+      <w:r>
+        <w:t>Streamlit</w:t>
+      </w:r>
+      <w:proofErr w:type="spellEnd"/>
+      <w:r>
+        <w:t xml:space="preserve"> as a second home </w:t>
+      </w:r>
+      <w:r>
+        <w:rPr>
+          <w:rFonts w:ascii="Apple Color Emoji" w:hAnsi="Apple Color Emoji" w:cs="Apple Color Emoji"/>
+        </w:rPr>
+        <w:t>🏠</w:t>
+      </w:r>
+      <w:r>
+        <w:t>.</w:t>
+      </w:r>
+    </w:p>
+    <w:p/>
+    <w:p>
+      <w:r>
+        <w:t>Jokes I like</w:t>
+      </w:r>
+    </w:p>
+    <w:p>
+      <w:r>
+        <w:tab/>
+        <w:t>•</w:t>
+      </w:r>
+      <w:r>
+        <w:tab/>
+        <w:t>Why did the LLM break up with the tokenizer?</w:t>
+      </w:r>
+    </w:p>
+    <w:p>
+      <w:r>
+        <w:t xml:space="preserve">→ “You always split me up when I get too emotional!” </w:t>
+      </w:r>
+      <w:r>
+        <w:rPr>
+          <w:rFonts w:ascii="Apple Color Emoji" w:hAnsi="Apple Color Emoji" w:cs="Apple Color Emoji"/>
+        </w:rPr>
+        <w:t>😂</w:t>
+      </w:r>
+    </w:p>
+    <w:p>
+      <w:r>
+        <w:tab/>
+        <w:t>•</w:t>
+      </w:r>
+      <w:r>
+        <w:tab/>
+        <w:t>How many data scientists does it take to change a light bulb?</w:t>
+      </w:r>
+    </w:p>
+    <w:p>
+      <w:r>
+        <w:t>→ “Just one, but only if there’s enough labeled training data.”</w:t>
       </w:r>
     </w:p>
     <w:sectPr>
@@ -4622,6 +5004,119 @@
 <file path=word/numbering.xml><?xml version="1.0" encoding="utf-8"?>
 <w:numbering xmlns:wpc="http://schemas.microsoft.com/office/word/2010/wordprocessingCanvas" xmlns:cx="http://schemas.microsoft.com/office/drawing/2014/chartex" xmlns:cx1="http://schemas.microsoft.com/office/drawing/2015/9/8/chartex" xmlns:cx2="http://schemas.microsoft.com/office/drawing/2015/10/21/chartex" xmlns:cx3="http://schemas.microsoft.com/office/drawing/2016/5/9/chartex" xmlns:cx4="http://schemas.microsoft.com/office/drawing/2016/5/10/chartex" xmlns:cx5="http://schemas.microsoft.com/office/drawing/2016/5/11/chartex" xmlns:cx6="http://schemas.microsoft.com/office/drawing/2016/5/12/chartex" xmlns:cx7="http://schemas.microsoft.com/office/drawing/2016/5/13/chartex" xmlns:cx8="http://schemas.microsoft.com/office/drawing/2016/5/14/chartex" xmlns:mc="http://schemas.openxmlformats.org/markup-compatibility/2006" xmlns:aink="http://schemas.microsoft.com/office/drawing/2016/ink" xmlns:am3d="http://schemas.microsoft.com/office/drawing/2017/model3d" xmlns:o="urn:schemas-microsoft-com:office:office" xmlns:oel="http://schemas.microsoft.com/office/2019/extlst" xmlns:r="http://schemas.openxmlformats.org/officeDocument/2006/relationships" xmlns:m="http://schemas.openxmlformats.org/officeDocument/2006/math" xmlns:v="urn:schemas-microsoft-com:vml" xmlns:wp14="http://schemas.microsoft.com/office/word/2010/wordprocessingDrawing" xmlns:wp="http://schemas.openxmlformats.org/drawingml/2006/wordprocessingDrawing" xmlns:w10="urn:schemas-microsoft-com:office:word" xmlns:w="http://schemas.openxmlformats.org/wordprocessingml/2006/main" xmlns:w14="http://schemas.microsoft.com/office/word/2010/wordml" xmlns:w15="http://schemas.microsoft.com/office/word/2012/wordml" xmlns:w16cex="http://schemas.microsoft.com/office/word/2018/wordml/cex" xmlns:w16cid="http://schemas.microsoft.com/office/word/2016/wordml/cid" xmlns:w16="http://schemas.microsoft.com/office/word/2018/wordml" xmlns:w16du="http://schemas.microsoft.com/office/word/2023/wordml/word16du" xmlns:w16sdtdh="http://schemas.microsoft.com/office/word/2020/wordml/sdtdatahash" xmlns:w16sdtfl="http://schemas.microsoft.com/office/word/2024/wordml/sdtformatlock" xmlns:w16se="http://schemas.microsoft.com/office/word/2015/wordml/symex" xmlns:wpg="http://schemas.microsoft.com/office/word/2010/wordprocessingGroup" xmlns:wpi="http://schemas.microsoft.com/office/word/2010/wordprocessingInk" xmlns:wne="http://schemas.microsoft.com/office/word/2006/wordml" xmlns:wps="http://schemas.microsoft.com/office/word/2010/wordprocessingShape" mc:Ignorable="w14 w15 w16se w16cid w16 w16cex w16sdtdh w16sdtfl w16du wp14">
   <w:abstractNum w:abstractNumId="0" w15:restartNumberingAfterBreak="0">
+    <w:nsid w:val="022E43C6"/>
+    <w:multiLevelType w:val="hybridMultilevel"/>
+    <w:tmpl w:val="654C7B3A"/>
+    <w:lvl w:ilvl="0" w:tplc="08090001">
+      <w:start w:val="1"/>
+      <w:numFmt w:val="bullet"/>
+      <w:lvlText w:val=""/>
+      <w:lvlJc w:val="left"/>
+      <w:pPr>
+        <w:ind w:left="1440" w:hanging="360"/>
+      </w:pPr>
+      <w:rPr>
+        <w:rFonts w:ascii="Symbol" w:hAnsi="Symbol" w:hint="default"/>
+      </w:rPr>
+    </w:lvl>
+    <w:lvl w:ilvl="1" w:tplc="08090003" w:tentative="1">
+      <w:start w:val="1"/>
+      <w:numFmt w:val="bullet"/>
+      <w:lvlText w:val="o"/>
+      <w:lvlJc w:val="left"/>
+      <w:pPr>
+        <w:ind w:left="2160" w:hanging="360"/>
+      </w:pPr>
+      <w:rPr>
+        <w:rFonts w:ascii="Courier New" w:hAnsi="Courier New" w:hint="default"/>
+      </w:rPr>
+    </w:lvl>
+    <w:lvl w:ilvl="2" w:tplc="08090005" w:tentative="1">
+      <w:start w:val="1"/>
+      <w:numFmt w:val="bullet"/>
+      <w:lvlText w:val=""/>
+      <w:lvlJc w:val="left"/>
+      <w:pPr>
+        <w:ind w:left="2880" w:hanging="360"/>
+      </w:pPr>
+      <w:rPr>
+        <w:rFonts w:ascii="Wingdings" w:hAnsi="Wingdings" w:hint="default"/>
+      </w:rPr>
+    </w:lvl>
+    <w:lvl w:ilvl="3" w:tplc="08090001" w:tentative="1">
+      <w:start w:val="1"/>
+      <w:numFmt w:val="bullet"/>
+      <w:lvlText w:val=""/>
+      <w:lvlJc w:val="left"/>
+      <w:pPr>
+        <w:ind w:left="3600" w:hanging="360"/>
+      </w:pPr>
+      <w:rPr>
+        <w:rFonts w:ascii="Symbol" w:hAnsi="Symbol" w:hint="default"/>
+      </w:rPr>
+    </w:lvl>
+    <w:lvl w:ilvl="4" w:tplc="08090003" w:tentative="1">
+      <w:start w:val="1"/>
+      <w:numFmt w:val="bullet"/>
+      <w:lvlText w:val="o"/>
+      <w:lvlJc w:val="left"/>
+      <w:pPr>
+        <w:ind w:left="4320" w:hanging="360"/>
+      </w:pPr>
+      <w:rPr>
+        <w:rFonts w:ascii="Courier New" w:hAnsi="Courier New" w:hint="default"/>
+      </w:rPr>
+    </w:lvl>
+    <w:lvl w:ilvl="5" w:tplc="08090005" w:tentative="1">
+      <w:start w:val="1"/>
+      <w:numFmt w:val="bullet"/>
+      <w:lvlText w:val=""/>
+      <w:lvlJc w:val="left"/>
+      <w:pPr>
+        <w:ind w:left="5040" w:hanging="360"/>
+      </w:pPr>
+      <w:rPr>
+        <w:rFonts w:ascii="Wingdings" w:hAnsi="Wingdings" w:hint="default"/>
+      </w:rPr>
+    </w:lvl>
+    <w:lvl w:ilvl="6" w:tplc="08090001" w:tentative="1">
+      <w:start w:val="1"/>
+      <w:numFmt w:val="bullet"/>
+      <w:lvlText w:val=""/>
+      <w:lvlJc w:val="left"/>
+      <w:pPr>
+        <w:ind w:left="5760" w:hanging="360"/>
+      </w:pPr>
+      <w:rPr>
+        <w:rFonts w:ascii="Symbol" w:hAnsi="Symbol" w:hint="default"/>
+      </w:rPr>
+    </w:lvl>
+    <w:lvl w:ilvl="7" w:tplc="08090003" w:tentative="1">
+      <w:start w:val="1"/>
+      <w:numFmt w:val="bullet"/>
+      <w:lvlText w:val="o"/>
+      <w:lvlJc w:val="left"/>
+      <w:pPr>
+        <w:ind w:left="6480" w:hanging="360"/>
+      </w:pPr>
+      <w:rPr>
+        <w:rFonts w:ascii="Courier New" w:hAnsi="Courier New" w:hint="default"/>
+      </w:rPr>
+    </w:lvl>
+    <w:lvl w:ilvl="8" w:tplc="08090005" w:tentative="1">
+      <w:start w:val="1"/>
+      <w:numFmt w:val="bullet"/>
+      <w:lvlText w:val=""/>
+      <w:lvlJc w:val="left"/>
+      <w:pPr>
+        <w:ind w:left="7200" w:hanging="360"/>
+      </w:pPr>
+      <w:rPr>
+        <w:rFonts w:ascii="Wingdings" w:hAnsi="Wingdings" w:hint="default"/>
+      </w:rPr>
+    </w:lvl>
+  </w:abstractNum>
+  <w:abstractNum w:abstractNumId="1" w15:restartNumberingAfterBreak="0">
     <w:nsid w:val="10CB6325"/>
     <w:multiLevelType w:val="multilevel"/>
     <w:tmpl w:val="7A082A1E"/>
@@ -4734,7 +5229,7 @@
       </w:rPr>
     </w:lvl>
   </w:abstractNum>
-  <w:abstractNum w:abstractNumId="1" w15:restartNumberingAfterBreak="0">
+  <w:abstractNum w:abstractNumId="2" w15:restartNumberingAfterBreak="0">
     <w:nsid w:val="13670AC9"/>
     <w:multiLevelType w:val="multilevel"/>
     <w:tmpl w:val="EB6A0072"/>
@@ -4847,7 +5342,7 @@
       </w:rPr>
     </w:lvl>
   </w:abstractNum>
-  <w:abstractNum w:abstractNumId="2" w15:restartNumberingAfterBreak="0">
+  <w:abstractNum w:abstractNumId="3" w15:restartNumberingAfterBreak="0">
     <w:nsid w:val="1D8C2FD3"/>
     <w:multiLevelType w:val="multilevel"/>
     <w:tmpl w:val="B6AA1284"/>
@@ -4960,7 +5455,7 @@
       </w:rPr>
     </w:lvl>
   </w:abstractNum>
-  <w:abstractNum w:abstractNumId="3" w15:restartNumberingAfterBreak="0">
+  <w:abstractNum w:abstractNumId="4" w15:restartNumberingAfterBreak="0">
     <w:nsid w:val="22EA1313"/>
     <w:multiLevelType w:val="multilevel"/>
     <w:tmpl w:val="0CD6F1C6"/>
@@ -5073,7 +5568,7 @@
       </w:rPr>
     </w:lvl>
   </w:abstractNum>
-  <w:abstractNum w:abstractNumId="4" w15:restartNumberingAfterBreak="0">
+  <w:abstractNum w:abstractNumId="5" w15:restartNumberingAfterBreak="0">
     <w:nsid w:val="2CB30F28"/>
     <w:multiLevelType w:val="multilevel"/>
     <w:tmpl w:val="32400C86"/>
@@ -5186,7 +5681,7 @@
       </w:rPr>
     </w:lvl>
   </w:abstractNum>
-  <w:abstractNum w:abstractNumId="5" w15:restartNumberingAfterBreak="0">
+  <w:abstractNum w:abstractNumId="6" w15:restartNumberingAfterBreak="0">
     <w:nsid w:val="3CBF2657"/>
     <w:multiLevelType w:val="multilevel"/>
     <w:tmpl w:val="06ECC3FC"/>
@@ -5299,7 +5794,7 @@
       </w:rPr>
     </w:lvl>
   </w:abstractNum>
-  <w:abstractNum w:abstractNumId="6" w15:restartNumberingAfterBreak="0">
+  <w:abstractNum w:abstractNumId="7" w15:restartNumberingAfterBreak="0">
     <w:nsid w:val="3E4B7DF4"/>
     <w:multiLevelType w:val="multilevel"/>
     <w:tmpl w:val="8DA203F2"/>
@@ -5412,7 +5907,7 @@
       </w:rPr>
     </w:lvl>
   </w:abstractNum>
-  <w:abstractNum w:abstractNumId="7" w15:restartNumberingAfterBreak="0">
+  <w:abstractNum w:abstractNumId="8" w15:restartNumberingAfterBreak="0">
     <w:nsid w:val="41B90970"/>
     <w:multiLevelType w:val="multilevel"/>
     <w:tmpl w:val="94C27AEA"/>
@@ -5525,7 +6020,7 @@
       </w:rPr>
     </w:lvl>
   </w:abstractNum>
-  <w:abstractNum w:abstractNumId="8" w15:restartNumberingAfterBreak="0">
+  <w:abstractNum w:abstractNumId="9" w15:restartNumberingAfterBreak="0">
     <w:nsid w:val="45B628B2"/>
     <w:multiLevelType w:val="hybridMultilevel"/>
     <w:tmpl w:val="4F026290"/>
@@ -5614,7 +6109,7 @@
       </w:pPr>
     </w:lvl>
   </w:abstractNum>
-  <w:abstractNum w:abstractNumId="9" w15:restartNumberingAfterBreak="0">
+  <w:abstractNum w:abstractNumId="10" w15:restartNumberingAfterBreak="0">
     <w:nsid w:val="56D62246"/>
     <w:multiLevelType w:val="multilevel"/>
     <w:tmpl w:val="0D32B204"/>
@@ -5727,7 +6222,7 @@
       </w:rPr>
     </w:lvl>
   </w:abstractNum>
-  <w:abstractNum w:abstractNumId="10" w15:restartNumberingAfterBreak="0">
+  <w:abstractNum w:abstractNumId="11" w15:restartNumberingAfterBreak="0">
     <w:nsid w:val="622F633E"/>
     <w:multiLevelType w:val="multilevel"/>
     <w:tmpl w:val="FB9AD2CC"/>
@@ -5840,7 +6335,7 @@
       </w:rPr>
     </w:lvl>
   </w:abstractNum>
-  <w:abstractNum w:abstractNumId="11" w15:restartNumberingAfterBreak="0">
+  <w:abstractNum w:abstractNumId="12" w15:restartNumberingAfterBreak="0">
     <w:nsid w:val="79A74551"/>
     <w:multiLevelType w:val="multilevel"/>
     <w:tmpl w:val="E76A6A04"/>
@@ -5954,40 +6449,43 @@
     </w:lvl>
   </w:abstractNum>
   <w:num w:numId="1" w16cid:durableId="623729956">
+    <w:abstractNumId w:val="11"/>
+  </w:num>
+  <w:num w:numId="2" w16cid:durableId="1997606423">
+    <w:abstractNumId w:val="8"/>
+  </w:num>
+  <w:num w:numId="3" w16cid:durableId="1183738081">
+    <w:abstractNumId w:val="2"/>
+  </w:num>
+  <w:num w:numId="4" w16cid:durableId="2111243987">
+    <w:abstractNumId w:val="1"/>
+  </w:num>
+  <w:num w:numId="5" w16cid:durableId="778985835">
+    <w:abstractNumId w:val="5"/>
+  </w:num>
+  <w:num w:numId="6" w16cid:durableId="1322931800">
     <w:abstractNumId w:val="10"/>
   </w:num>
-  <w:num w:numId="2" w16cid:durableId="1997606423">
+  <w:num w:numId="7" w16cid:durableId="121308769">
     <w:abstractNumId w:val="7"/>
   </w:num>
-  <w:num w:numId="3" w16cid:durableId="1183738081">
-    <w:abstractNumId w:val="1"/>
-  </w:num>
-  <w:num w:numId="4" w16cid:durableId="2111243987">
-    <w:abstractNumId w:val="0"/>
-  </w:num>
-  <w:num w:numId="5" w16cid:durableId="778985835">
+  <w:num w:numId="8" w16cid:durableId="195772696">
     <w:abstractNumId w:val="4"/>
   </w:num>
-  <w:num w:numId="6" w16cid:durableId="1322931800">
+  <w:num w:numId="9" w16cid:durableId="2144274776">
+    <w:abstractNumId w:val="3"/>
+  </w:num>
+  <w:num w:numId="10" w16cid:durableId="814224372">
+    <w:abstractNumId w:val="12"/>
+  </w:num>
+  <w:num w:numId="11" w16cid:durableId="1316643842">
+    <w:abstractNumId w:val="6"/>
+  </w:num>
+  <w:num w:numId="12" w16cid:durableId="675577428">
     <w:abstractNumId w:val="9"/>
   </w:num>
-  <w:num w:numId="7" w16cid:durableId="121308769">
-    <w:abstractNumId w:val="6"/>
-  </w:num>
-  <w:num w:numId="8" w16cid:durableId="195772696">
-    <w:abstractNumId w:val="3"/>
-  </w:num>
-  <w:num w:numId="9" w16cid:durableId="2144274776">
-    <w:abstractNumId w:val="2"/>
-  </w:num>
-  <w:num w:numId="10" w16cid:durableId="814224372">
-    <w:abstractNumId w:val="11"/>
-  </w:num>
-  <w:num w:numId="11" w16cid:durableId="1316643842">
-    <w:abstractNumId w:val="5"/>
-  </w:num>
-  <w:num w:numId="12" w16cid:durableId="675577428">
-    <w:abstractNumId w:val="8"/>
+  <w:num w:numId="13" w16cid:durableId="424961871">
+    <w:abstractNumId w:val="0"/>
   </w:num>
 </w:numbering>
 </file>
@@ -6660,6 +7158,29 @@
     <w:basedOn w:val="DefaultParagraphFont"/>
     <w:rsid w:val="009875E0"/>
   </w:style>
+  <w:style w:type="character" w:styleId="Hyperlink">
+    <w:name w:val="Hyperlink"/>
+    <w:basedOn w:val="DefaultParagraphFont"/>
+    <w:uiPriority w:val="99"/>
+    <w:unhideWhenUsed/>
+    <w:rsid w:val="00C3399A"/>
+    <w:rPr>
+      <w:color w:val="0000FF" w:themeColor="hyperlink"/>
+      <w:u w:val="single"/>
+    </w:rPr>
+  </w:style>
+  <w:style w:type="character" w:styleId="UnresolvedMention">
+    <w:name w:val="Unresolved Mention"/>
+    <w:basedOn w:val="DefaultParagraphFont"/>
+    <w:uiPriority w:val="99"/>
+    <w:semiHidden/>
+    <w:unhideWhenUsed/>
+    <w:rsid w:val="00C3399A"/>
+    <w:rPr>
+      <w:color w:val="605E5C"/>
+      <w:shd w:val="clear" w:color="auto" w:fill="E1DFDD"/>
+    </w:rPr>
+  </w:style>
 </w:styles>
 </file>
 

</xml_diff>

<commit_message>
Updated Document with Little Frontend Changes
</commit_message>
<xml_diff>
--- a/Document.docx
+++ b/Document.docx
@@ -84,6 +84,11 @@
     </w:p>
     <w:p>
       <w:r>
+        <w:t>Age – 28 years</w:t>
+      </w:r>
+    </w:p>
+    <w:p>
+      <w:r>
         <w:t>Marital Status - Single</w:t>
       </w:r>
     </w:p>
@@ -564,6 +569,7 @@
         <w:pStyle w:val="p4"/>
       </w:pPr>
       <w:r>
+        <w:lastRenderedPageBreak/>
         <w:t>•</w:t>
       </w:r>
       <w:r>
@@ -729,7 +735,19 @@
         <w:rPr>
           <w:i/>
         </w:rPr>
-        <w:t>(Mar-2024 – Present)</w:t>
+        <w:t>(Mar-202</w:t>
+      </w:r>
+      <w:r>
+        <w:rPr>
+          <w:i/>
+        </w:rPr>
+        <w:t>5</w:t>
+      </w:r>
+      <w:r>
+        <w:rPr>
+          <w:i/>
+        </w:rPr>
+        <w:t xml:space="preserve"> – Present)</w:t>
       </w:r>
     </w:p>
     <w:p>
@@ -946,6 +964,9 @@
       <w:r>
         <w:t xml:space="preserve"> ltd</w:t>
       </w:r>
+      <w:r>
+        <w:t xml:space="preserve"> </w:t>
+      </w:r>
     </w:p>
     <w:p>
       <w:pPr>
@@ -998,6 +1019,7 @@
         <w:rPr>
           <w:b/>
         </w:rPr>
+        <w:lastRenderedPageBreak/>
         <w:t>Designed and implemented machine learning and deep learning models</w:t>
       </w:r>
       <w:r>
@@ -1024,7 +1046,6 @@
         <w:rPr>
           <w:b/>
         </w:rPr>
-        <w:lastRenderedPageBreak/>
         <w:t>Led end-to-end AI/ML product development</w:t>
       </w:r>
       <w:r>
@@ -1127,15 +1148,16 @@
         </w:numPr>
       </w:pPr>
       <w:r>
-        <w:t xml:space="preserve">Technical Assistant - </w:t>
-      </w:r>
-      <w:proofErr w:type="spellStart"/>
-      <w:r>
-        <w:t>KIIt</w:t>
-      </w:r>
-      <w:proofErr w:type="spellEnd"/>
+        <w:t>Technical Assistant - KII</w:t>
+      </w:r>
+      <w:r>
+        <w:t>T</w:t>
+      </w:r>
       <w:r>
         <w:t xml:space="preserve"> University </w:t>
+      </w:r>
+      <w:r>
+        <w:t>(Work Experience)</w:t>
       </w:r>
     </w:p>
     <w:p>
@@ -1297,6 +1319,38 @@
           <w:lang w:val="en"/>
         </w:rPr>
       </w:pPr>
+      <w:r>
+        <w:rPr>
+          <w:rFonts w:ascii="Arial" w:eastAsia="Arial" w:hAnsi="Arial" w:cs="Arial"/>
+          <w:b/>
+          <w:sz w:val="22"/>
+          <w:szCs w:val="22"/>
+          <w:lang w:val="en"/>
+        </w:rPr>
+        <w:t>LNR Risk</w:t>
+      </w:r>
+      <w:r>
+        <w:rPr>
+          <w:rFonts w:ascii="Arial" w:eastAsia="Arial" w:hAnsi="Arial" w:cs="Arial"/>
+          <w:b/>
+          <w:sz w:val="22"/>
+          <w:szCs w:val="22"/>
+          <w:lang w:val="en"/>
+        </w:rPr>
+        <w:t xml:space="preserve"> </w:t>
+      </w:r>
+      <w:proofErr w:type="spellStart"/>
+      <w:r>
+        <w:rPr>
+          <w:rFonts w:ascii="Arial" w:eastAsia="Arial" w:hAnsi="Arial" w:cs="Arial"/>
+          <w:b/>
+          <w:sz w:val="22"/>
+          <w:szCs w:val="22"/>
+          <w:lang w:val="en"/>
+        </w:rPr>
+        <w:t>LexusNexus</w:t>
+      </w:r>
+      <w:proofErr w:type="spellEnd"/>
       <w:r>
         <w:rPr>
           <w:rFonts w:ascii="Arial" w:eastAsia="Arial" w:hAnsi="Arial" w:cs="Arial"/>
@@ -1305,7 +1359,7 @@
           <w:szCs w:val="22"/>
           <w:lang w:val="en"/>
         </w:rPr>
-        <w:t>LNR Risk -</w:t>
+        <w:t xml:space="preserve"> -</w:t>
       </w:r>
       <w:r>
         <w:rPr>
@@ -1412,7 +1466,7 @@
       <w:r>
         <w:rPr>
           <w:rFonts w:ascii="Arial" w:eastAsia="Arial" w:hAnsi="Arial" w:cs="Arial"/>
-          <w:bCs/>
+          <w:b/>
           <w:sz w:val="22"/>
           <w:szCs w:val="22"/>
           <w:lang w:val="en"/>
@@ -1420,6 +1474,27 @@
         <w:t xml:space="preserve">Axis </w:t>
       </w:r>
       <w:proofErr w:type="spellStart"/>
+      <w:r>
+        <w:rPr>
+          <w:rFonts w:ascii="Arial" w:eastAsia="Arial" w:hAnsi="Arial" w:cs="Arial"/>
+          <w:b/>
+          <w:sz w:val="22"/>
+          <w:szCs w:val="22"/>
+          <w:lang w:val="en"/>
+        </w:rPr>
+        <w:t>Maxlife</w:t>
+      </w:r>
+      <w:proofErr w:type="spellEnd"/>
+      <w:r>
+        <w:rPr>
+          <w:rFonts w:ascii="Arial" w:eastAsia="Arial" w:hAnsi="Arial" w:cs="Arial"/>
+          <w:b/>
+          <w:sz w:val="22"/>
+          <w:szCs w:val="22"/>
+          <w:lang w:val="en"/>
+        </w:rPr>
+        <w:t xml:space="preserve"> Chatbot</w:t>
+      </w:r>
       <w:r>
         <w:rPr>
           <w:rFonts w:ascii="Arial" w:eastAsia="Arial" w:hAnsi="Arial" w:cs="Arial"/>
@@ -1428,7 +1503,17 @@
           <w:szCs w:val="22"/>
           <w:lang w:val="en"/>
         </w:rPr>
-        <w:t>Maxlife</w:t>
+        <w:t xml:space="preserve"> - Currently leading the development of an AI-powered, agentic SQL chatbot for Axis Max Life using </w:t>
+      </w:r>
+      <w:proofErr w:type="spellStart"/>
+      <w:r>
+        <w:rPr>
+          <w:rFonts w:ascii="Arial" w:eastAsia="Arial" w:hAnsi="Arial" w:cs="Arial"/>
+          <w:sz w:val="22"/>
+          <w:szCs w:val="22"/>
+          <w:lang w:val="en"/>
+        </w:rPr>
+        <w:t>LangGraph</w:t>
       </w:r>
       <w:proofErr w:type="spellEnd"/>
       <w:r>
@@ -1439,9 +1524,8 @@
           <w:szCs w:val="22"/>
           <w:lang w:val="en"/>
         </w:rPr>
-        <w:t xml:space="preserve"> Chatbot - Currently leading the development of an AI-powered, agentic SQL chatbot for Axis Max Life using </w:t>
-      </w:r>
-      <w:proofErr w:type="spellStart"/>
+        <w:t xml:space="preserve"> to orchestrate multi-step reasoning and chain-of-thought execution. The chatbot leverages </w:t>
+      </w:r>
       <w:r>
         <w:rPr>
           <w:rFonts w:ascii="Arial" w:eastAsia="Arial" w:hAnsi="Arial" w:cs="Arial"/>
@@ -1449,9 +1533,8 @@
           <w:szCs w:val="22"/>
           <w:lang w:val="en"/>
         </w:rPr>
-        <w:t>LangGraph</w:t>
-      </w:r>
-      <w:proofErr w:type="spellEnd"/>
+        <w:t>GPT-4o</w:t>
+      </w:r>
       <w:r>
         <w:rPr>
           <w:rFonts w:ascii="Arial" w:eastAsia="Arial" w:hAnsi="Arial" w:cs="Arial"/>
@@ -1460,8 +1543,9 @@
           <w:szCs w:val="22"/>
           <w:lang w:val="en"/>
         </w:rPr>
-        <w:t xml:space="preserve"> to orchestrate multi-step reasoning and chain-of-thought execution. The chatbot leverages </w:t>
-      </w:r>
+        <w:t xml:space="preserve"> to convert natural language queries into optimized SQL, querying a secure replica of the Redshift database. Built with </w:t>
+      </w:r>
+      <w:proofErr w:type="spellStart"/>
       <w:r>
         <w:rPr>
           <w:rFonts w:ascii="Arial" w:eastAsia="Arial" w:hAnsi="Arial" w:cs="Arial"/>
@@ -1469,8 +1553,9 @@
           <w:szCs w:val="22"/>
           <w:lang w:val="en"/>
         </w:rPr>
-        <w:t>GPT-4o</w:t>
-      </w:r>
+        <w:t>FastAPI</w:t>
+      </w:r>
+      <w:proofErr w:type="spellEnd"/>
       <w:r>
         <w:rPr>
           <w:rFonts w:ascii="Arial" w:eastAsia="Arial" w:hAnsi="Arial" w:cs="Arial"/>
@@ -1479,7 +1564,7 @@
           <w:szCs w:val="22"/>
           <w:lang w:val="en"/>
         </w:rPr>
-        <w:t xml:space="preserve"> to convert natural language queries into optimized SQL, querying a secure replica of the Redshift database. Built with </w:t>
+        <w:t xml:space="preserve"> and </w:t>
       </w:r>
       <w:proofErr w:type="spellStart"/>
       <w:r>
@@ -1489,7 +1574,7 @@
           <w:szCs w:val="22"/>
           <w:lang w:val="en"/>
         </w:rPr>
-        <w:t>FastAPI</w:t>
+        <w:t>Streamlit</w:t>
       </w:r>
       <w:proofErr w:type="spellEnd"/>
       <w:r>
@@ -1500,19 +1585,8 @@
           <w:szCs w:val="22"/>
           <w:lang w:val="en"/>
         </w:rPr>
-        <w:t xml:space="preserve"> and </w:t>
-      </w:r>
-      <w:proofErr w:type="spellStart"/>
-      <w:r>
-        <w:rPr>
-          <w:rFonts w:ascii="Arial" w:eastAsia="Arial" w:hAnsi="Arial" w:cs="Arial"/>
-          <w:sz w:val="22"/>
-          <w:szCs w:val="22"/>
-          <w:lang w:val="en"/>
-        </w:rPr>
-        <w:t>Streamlit</w:t>
-      </w:r>
-      <w:proofErr w:type="spellEnd"/>
+        <w:t xml:space="preserve">, the solution supports contextual conversations, daily PDF </w:t>
+      </w:r>
       <w:r>
         <w:rPr>
           <w:rFonts w:ascii="Arial" w:eastAsia="Arial" w:hAnsi="Arial" w:cs="Arial"/>
@@ -1521,18 +1595,8 @@
           <w:szCs w:val="22"/>
           <w:lang w:val="en"/>
         </w:rPr>
-        <w:t xml:space="preserve">, the solution supports contextual conversations, daily PDF performance reports, anomaly detection, and personalized recommendations for underperforming agents. By integrating agentic workflows and memory, the system enables dynamic, interactive analytics and empowers business users to gain insights </w:t>
-      </w:r>
-      <w:r>
-        <w:rPr>
-          <w:rFonts w:ascii="Arial" w:eastAsia="Arial" w:hAnsi="Arial" w:cs="Arial"/>
-          <w:bCs/>
-          <w:sz w:val="22"/>
-          <w:szCs w:val="22"/>
-          <w:lang w:val="en"/>
-        </w:rPr>
         <w:lastRenderedPageBreak/>
-        <w:t>without technical expertise—streamlining performance monitoring and strategic decision-making.</w:t>
+        <w:t>performance reports, anomaly detection, and personalized recommendations for underperforming agents. By integrating agentic workflows and memory, the system enables dynamic, interactive analytics and empowers business users to gain insights without technical expertise—streamlining performance monitoring and strategic decision-making.</w:t>
       </w:r>
     </w:p>
     <w:p/>
@@ -1915,13 +1979,16 @@
         <w:t>transcripts and extracts critical insights</w:t>
       </w:r>
       <w:r>
-        <w:t xml:space="preserve">, ensuring concise and accurate reporting for better decision-making. The system enhances </w:t>
-      </w:r>
-      <w:r>
-        <w:rPr>
-          <w:b/>
-        </w:rPr>
+        <w:t xml:space="preserve">, ensuring </w:t>
+      </w:r>
+      <w:r>
         <w:lastRenderedPageBreak/>
+        <w:t xml:space="preserve">concise and accurate reporting for better decision-making. The system enhances </w:t>
+      </w:r>
+      <w:r>
+        <w:rPr>
+          <w:b/>
+        </w:rPr>
         <w:t>meeting productivity</w:t>
       </w:r>
       <w:r>
@@ -4566,6 +4633,381 @@
       <w:pPr>
         <w:rPr>
           <w:b/>
+          <w:bCs/>
+        </w:rPr>
+      </w:pPr>
+    </w:p>
+    <w:p>
+      <w:pPr>
+        <w:rPr>
+          <w:b/>
+          <w:bCs/>
+        </w:rPr>
+      </w:pPr>
+      <w:r>
+        <w:rPr>
+          <w:rFonts w:ascii="Apple Color Emoji" w:hAnsi="Apple Color Emoji" w:cs="Apple Color Emoji"/>
+          <w:b/>
+          <w:bCs/>
+        </w:rPr>
+        <w:t>🧑</w:t>
+      </w:r>
+      <w:r>
+        <w:rPr>
+          <w:b/>
+          <w:bCs/>
+        </w:rPr>
+        <w:t>‍</w:t>
+      </w:r>
+      <w:r>
+        <w:rPr>
+          <w:rFonts w:ascii="Apple Color Emoji" w:hAnsi="Apple Color Emoji" w:cs="Apple Color Emoji"/>
+          <w:b/>
+          <w:bCs/>
+        </w:rPr>
+        <w:t>🏫</w:t>
+      </w:r>
+      <w:r>
+        <w:rPr>
+          <w:b/>
+          <w:bCs/>
+        </w:rPr>
+        <w:t xml:space="preserve"> Mentorship, Teaching, and Career Guidance</w:t>
+      </w:r>
+    </w:p>
+    <w:p/>
+    <w:p>
+      <w:r>
+        <w:t>With a strong inclination toward teaching and knowledge sharing, I’ve mentored a diverse set of learners — from school students to working professionals — across various EdTech platforms. My mentorship spans Python programming, data science, machine learning, and end-to-end career readiness.</w:t>
+      </w:r>
+    </w:p>
+    <w:p/>
+    <w:p>
+      <w:r>
+        <w:rPr>
+          <w:rFonts w:ascii="Apple Color Emoji" w:hAnsi="Apple Color Emoji" w:cs="Apple Color Emoji"/>
+        </w:rPr>
+        <w:t>🐍</w:t>
+      </w:r>
+      <w:r>
+        <w:t xml:space="preserve"> Python Instructor – </w:t>
+      </w:r>
+      <w:proofErr w:type="spellStart"/>
+      <w:r>
+        <w:t>Cuemath</w:t>
+      </w:r>
+      <w:proofErr w:type="spellEnd"/>
+      <w:r>
+        <w:t xml:space="preserve"> (2 Years)</w:t>
+      </w:r>
+    </w:p>
+    <w:p>
+      <w:r>
+        <w:tab/>
+        <w:t>•Worked as a Certified Python Teacher Expert, delivering 1-on-1 and group sessions for school students and early-stage coders.</w:t>
+      </w:r>
+    </w:p>
+    <w:p>
+      <w:r>
+        <w:tab/>
+        <w:t>•Simplified core programming topics like variables, loops, functions, lists, and recursion, tailored to each learner’s level.</w:t>
+      </w:r>
+    </w:p>
+    <w:p>
+      <w:r>
+        <w:tab/>
+        <w:t>•Designed interactive learning modules and logic-based games to build computational thinking.</w:t>
+      </w:r>
+    </w:p>
+    <w:p>
+      <w:r>
+        <w:tab/>
+        <w:t xml:space="preserve">•Mentored 150+ students, helping many of them publish their first Python </w:t>
+      </w:r>
+      <w:proofErr w:type="gramStart"/>
+      <w:r>
+        <w:t>mini-projects</w:t>
+      </w:r>
+      <w:proofErr w:type="gramEnd"/>
+      <w:r>
+        <w:t>.</w:t>
+      </w:r>
+    </w:p>
+    <w:p/>
+    <w:p>
+      <w:r>
+        <w:rPr>
+          <w:rFonts w:ascii="Apple Color Emoji" w:hAnsi="Apple Color Emoji" w:cs="Apple Color Emoji"/>
+        </w:rPr>
+        <w:t>🎯</w:t>
+      </w:r>
+      <w:r>
+        <w:t xml:space="preserve"> Data Science Mentor – </w:t>
+      </w:r>
+      <w:proofErr w:type="spellStart"/>
+      <w:r>
+        <w:t>CoachXLive</w:t>
+      </w:r>
+      <w:proofErr w:type="spellEnd"/>
+      <w:r>
+        <w:t xml:space="preserve"> (6 Months)</w:t>
+      </w:r>
+    </w:p>
+    <w:p>
+      <w:r>
+        <w:tab/>
+        <w:t>•Provided personalized guidance to college graduates and early-career professionals transitioning into data science.</w:t>
+      </w:r>
+    </w:p>
+    <w:p>
+      <w:r>
+        <w:tab/>
+        <w:t>•Helped learners build portfolio-ready projects, including:</w:t>
+      </w:r>
+    </w:p>
+    <w:p>
+      <w:r>
+        <w:tab/>
+        <w:t>•Customer segmentation using clustering</w:t>
+      </w:r>
+    </w:p>
+    <w:p>
+      <w:r>
+        <w:tab/>
+        <w:t>•Sentiment analysis using NLP</w:t>
+      </w:r>
+    </w:p>
+    <w:p>
+      <w:r>
+        <w:tab/>
+        <w:t>•Sales forecasting with time-series models</w:t>
+      </w:r>
+    </w:p>
+    <w:p>
+      <w:r>
+        <w:lastRenderedPageBreak/>
+        <w:tab/>
+        <w:t>•Led mock interviews, resume reviews, and LinkedIn profile improvements to accelerate job placements.</w:t>
+      </w:r>
+    </w:p>
+    <w:p>
+      <w:r>
+        <w:tab/>
+        <w:t>•Mentored 50+ students, with several securing roles as Data Analysts and Junior ML Engineers.</w:t>
+      </w:r>
+    </w:p>
+    <w:p/>
+    <w:p>
+      <w:r>
+        <w:rPr>
+          <w:rFonts w:ascii="Apple Color Emoji" w:hAnsi="Apple Color Emoji" w:cs="Apple Color Emoji"/>
+        </w:rPr>
+        <w:t>🧠</w:t>
+      </w:r>
+      <w:r>
+        <w:t xml:space="preserve"> Mentor – GUVI, </w:t>
+      </w:r>
+      <w:proofErr w:type="spellStart"/>
+      <w:r>
+        <w:t>Edureka</w:t>
+      </w:r>
+      <w:proofErr w:type="spellEnd"/>
+      <w:r>
+        <w:t>, and Great Learning</w:t>
+      </w:r>
+    </w:p>
+    <w:p>
+      <w:r>
+        <w:tab/>
+        <w:t>•Served as a domain expert and capstone reviewer, supporting learners in structured learning paths.</w:t>
+      </w:r>
+    </w:p>
+    <w:p>
+      <w:r>
+        <w:tab/>
+        <w:t>•Mentored over 800 learners across batches, providing project feedback, assignment walkthroughs, and technical mentoring.</w:t>
+      </w:r>
+    </w:p>
+    <w:p>
+      <w:r>
+        <w:tab/>
+        <w:t>•Topics covered include:</w:t>
+      </w:r>
+    </w:p>
+    <w:p>
+      <w:r>
+        <w:tab/>
+        <w:t>•Python for Data Science (NumPy, Pandas, Matplotlib)</w:t>
+      </w:r>
+    </w:p>
+    <w:p>
+      <w:r>
+        <w:tab/>
+        <w:t>•Machine Learning (Regression, Classification, Clustering)</w:t>
+      </w:r>
+    </w:p>
+    <w:p>
+      <w:r>
+        <w:tab/>
+        <w:t>•Deep Learning (CNN, RNN, LSTM)</w:t>
+      </w:r>
+    </w:p>
+    <w:p>
+      <w:r>
+        <w:tab/>
+        <w:t xml:space="preserve">•Deployment (Flask, </w:t>
+      </w:r>
+      <w:proofErr w:type="spellStart"/>
+      <w:r>
+        <w:t>FastAPI</w:t>
+      </w:r>
+      <w:proofErr w:type="spellEnd"/>
+      <w:r>
+        <w:t xml:space="preserve">, </w:t>
+      </w:r>
+      <w:proofErr w:type="spellStart"/>
+      <w:r>
+        <w:t>Streamlit</w:t>
+      </w:r>
+      <w:proofErr w:type="spellEnd"/>
+      <w:r>
+        <w:t>, Docker)</w:t>
+      </w:r>
+    </w:p>
+    <w:p>
+      <w:r>
+        <w:tab/>
+        <w:t>•Guided real-world projects such as:</w:t>
+      </w:r>
+    </w:p>
+    <w:p>
+      <w:r>
+        <w:tab/>
+        <w:t>•Loan Default Prediction</w:t>
+      </w:r>
+    </w:p>
+    <w:p>
+      <w:r>
+        <w:tab/>
+        <w:t>•Resume Parser using NLP</w:t>
+      </w:r>
+    </w:p>
+    <w:p>
+      <w:r>
+        <w:tab/>
+        <w:t>•Stock Price Forecasting</w:t>
+      </w:r>
+    </w:p>
+    <w:p>
+      <w:r>
+        <w:tab/>
+        <w:t>•Chatbot Development</w:t>
+      </w:r>
+    </w:p>
+    <w:p>
+      <w:r>
+        <w:tab/>
+        <w:t>•Supported career transitions through soft-skill mentoring, interview preparation, and continuous learner engagement.</w:t>
+      </w:r>
+    </w:p>
+    <w:p/>
+    <w:p>
+      <w:r>
+        <w:rPr>
+          <w:rFonts w:ascii="Apple Color Emoji" w:hAnsi="Apple Color Emoji" w:cs="Apple Color Emoji"/>
+        </w:rPr>
+        <w:t>🌟</w:t>
+      </w:r>
+      <w:r>
+        <w:t xml:space="preserve"> Key Highlights</w:t>
+      </w:r>
+    </w:p>
+    <w:p>
+      <w:r>
+        <w:tab/>
+        <w:t>•</w:t>
+      </w:r>
+      <w:r>
+        <w:tab/>
+      </w:r>
+      <w:r>
+        <w:rPr>
+          <w:rFonts w:ascii="Apple Color Emoji" w:hAnsi="Apple Color Emoji" w:cs="Apple Color Emoji"/>
+        </w:rPr>
+        <w:t>🧑</w:t>
+      </w:r>
+      <w:r>
+        <w:t>‍</w:t>
+      </w:r>
+      <w:r>
+        <w:rPr>
+          <w:rFonts w:ascii="Apple Color Emoji" w:hAnsi="Apple Color Emoji" w:cs="Apple Color Emoji"/>
+        </w:rPr>
+        <w:t>🎓</w:t>
+      </w:r>
+      <w:r>
+        <w:t xml:space="preserve"> Mentored 1000+ learners across platforms.</w:t>
+      </w:r>
+    </w:p>
+    <w:p>
+      <w:r>
+        <w:tab/>
+        <w:t>•</w:t>
+      </w:r>
+      <w:r>
+        <w:tab/>
+      </w:r>
+      <w:r>
+        <w:rPr>
+          <w:rFonts w:ascii="Apple Color Emoji" w:hAnsi="Apple Color Emoji" w:cs="Apple Color Emoji"/>
+        </w:rPr>
+        <w:t>✅</w:t>
+      </w:r>
+      <w:r>
+        <w:t xml:space="preserve"> Helped 100+ learners complete capstone projects and secure internships or full-time roles.</w:t>
+      </w:r>
+    </w:p>
+    <w:p>
+      <w:r>
+        <w:tab/>
+        <w:t>•</w:t>
+      </w:r>
+      <w:r>
+        <w:tab/>
+      </w:r>
+      <w:r>
+        <w:rPr>
+          <w:rFonts w:ascii="Apple Color Emoji" w:hAnsi="Apple Color Emoji" w:cs="Apple Color Emoji"/>
+        </w:rPr>
+        <w:t>💬</w:t>
+      </w:r>
+      <w:r>
+        <w:t xml:space="preserve"> Consistently rated 4.8+ out of 5 across feedback platforms.</w:t>
+      </w:r>
+    </w:p>
+    <w:p>
+      <w:r>
+        <w:tab/>
+        <w:t>•</w:t>
+      </w:r>
+      <w:r>
+        <w:tab/>
+      </w:r>
+      <w:r>
+        <w:rPr>
+          <w:rFonts w:ascii="Apple Color Emoji" w:hAnsi="Apple Color Emoji" w:cs="Apple Color Emoji"/>
+        </w:rPr>
+        <w:t>📣</w:t>
+      </w:r>
+      <w:r>
+        <w:t xml:space="preserve"> Known for simplifying complex topics, offering career clarity, and building confidence in non-tech learners.</w:t>
+      </w:r>
+    </w:p>
+    <w:p/>
+    <w:p>
+      <w:pPr>
+        <w:rPr>
+          <w:b/>
         </w:rPr>
       </w:pPr>
       <w:r>
@@ -4628,6 +5070,51 @@
       </w:pPr>
       <w:r>
         <w:t xml:space="preserve">Resume Shortlisting </w:t>
+      </w:r>
+    </w:p>
+    <w:p>
+      <w:pPr>
+        <w:numPr>
+          <w:ilvl w:val="0"/>
+          <w:numId w:val="1"/>
+        </w:numPr>
+      </w:pPr>
+    </w:p>
+    <w:p>
+      <w:pPr>
+        <w:rPr>
+          <w:b/>
+        </w:rPr>
+      </w:pPr>
+      <w:r>
+        <w:rPr>
+          <w:b/>
+        </w:rPr>
+        <w:t>For Appointment</w:t>
+      </w:r>
+      <w:r>
+        <w:rPr>
+          <w:b/>
+        </w:rPr>
+        <w:t xml:space="preserve"> Booking </w:t>
+      </w:r>
+      <w:r>
+        <w:rPr>
+          <w:b/>
+        </w:rPr>
+        <w:t>–</w:t>
+      </w:r>
+      <w:r>
+        <w:rPr>
+          <w:b/>
+        </w:rPr>
+        <w:t xml:space="preserve"> </w:t>
+      </w:r>
+      <w:r>
+        <w:rPr>
+          <w:b/>
+        </w:rPr>
+        <w:t>Take the Free Slot</w:t>
       </w:r>
     </w:p>
     <w:p>
@@ -4653,8 +5140,10 @@
     </w:p>
     <w:p/>
     <w:p/>
-    <w:p>
-      <w:r>
+    <w:p/>
+    <w:p>
+      <w:r>
+        <w:lastRenderedPageBreak/>
         <w:t>⸻</w:t>
       </w:r>
     </w:p>
@@ -4737,7 +5226,6 @@
       </w:pPr>
       <w:proofErr w:type="spellStart"/>
       <w:r>
-        <w:lastRenderedPageBreak/>
         <w:t>Phuchka</w:t>
       </w:r>
       <w:proofErr w:type="spellEnd"/>
@@ -4909,7 +5397,12 @@
       </w:r>
       <w:r>
         <w:tab/>
-        <w:t>Once rode 800 km in a single stretch because Google Maps looked too optimistic.</w:t>
+        <w:t xml:space="preserve">Once rode 800 km in a single stretch because Google Maps looked too </w:t>
+      </w:r>
+    </w:p>
+    <w:p>
+      <w:r>
+        <w:t>optimistic.</w:t>
       </w:r>
     </w:p>
     <w:p>
@@ -4952,6 +5445,20 @@
     <w:p/>
     <w:p>
       <w:r>
+        <w:t xml:space="preserve">I have a Nice Bike, Triumph Speed </w:t>
+      </w:r>
+      <w:proofErr w:type="gramStart"/>
+      <w:r>
+        <w:t>400 !!</w:t>
+      </w:r>
+      <w:proofErr w:type="gramEnd"/>
+      <w:r>
+        <w:t xml:space="preserve"> I have ride that for more than 10000 kms. </w:t>
+      </w:r>
+    </w:p>
+    <w:p/>
+    <w:p>
+      <w:r>
         <w:t>Jokes I like</w:t>
       </w:r>
     </w:p>
@@ -4967,6 +5474,7 @@
     </w:p>
     <w:p>
       <w:r>
+        <w:lastRenderedPageBreak/>
         <w:t xml:space="preserve">→ “You always split me up when I get too emotional!” </w:t>
       </w:r>
       <w:r>

</xml_diff>

<commit_message>
Secure recommit without config.json
</commit_message>
<xml_diff>
--- a/Document.docx
+++ b/Document.docx
@@ -1158,6 +1158,15 @@
       </w:r>
       <w:r>
         <w:t>(Work Experience)</w:t>
+      </w:r>
+      <w:r>
+        <w:t xml:space="preserve"> (First </w:t>
+      </w:r>
+      <w:r>
+        <w:t xml:space="preserve">Full Time </w:t>
+      </w:r>
+      <w:r>
+        <w:t>Job)</w:t>
       </w:r>
     </w:p>
     <w:p>

</xml_diff>